<commit_message>
Actualización de detalles en informes
</commit_message>
<xml_diff>
--- a/Capstone/Fase 2/Evidencias del Proyecto/Informe Yourmeds - Proyecto Agil.docx
+++ b/Capstone/Fase 2/Evidencias del Proyecto/Informe Yourmeds - Proyecto Agil.docx
@@ -37,7 +37,7 @@
                     <pic:cNvPicPr preferRelativeResize="0"/>
                   </pic:nvPicPr>
                   <pic:blipFill>
-                    <a:blip r:embed="rId8"/>
+                    <a:blip r:embed="rId9"/>
                     <a:srcRect/>
                     <a:stretch>
                       <a:fillRect/>
@@ -486,10 +486,10 @@
           <w:szCs w:val="21"/>
         </w:rPr>
         <w:sectPr>
-          <w:headerReference w:type="even" r:id="rId9"/>
-          <w:headerReference w:type="default" r:id="rId10"/>
-          <w:footerReference w:type="even" r:id="rId11"/>
-          <w:footerReference w:type="default" r:id="rId12"/>
+          <w:headerReference w:type="even" r:id="rId10"/>
+          <w:headerReference w:type="default" r:id="rId11"/>
+          <w:footerReference w:type="even" r:id="rId12"/>
+          <w:footerReference w:type="default" r:id="rId13"/>
           <w:pgSz w:w="12240" w:h="15840"/>
           <w:pgMar w:top="0" w:right="1134" w:bottom="1418" w:left="1418" w:header="709" w:footer="709" w:gutter="0"/>
           <w:pgNumType w:start="2"/>
@@ -607,7 +607,39 @@
                                 <w:color w:val="20212C"/>
                                 <w:sz w:val="24"/>
                               </w:rPr>
-                              <w:t xml:space="preserve"> 20/08/2025</w:t>
+                              <w:t xml:space="preserve"> 2</w:t>
+                            </w:r>
+                            <w:r>
+                              <w:rPr>
+                                <w:rFonts w:ascii="Proxima Nova" w:eastAsia="Proxima Nova" w:hAnsi="Proxima Nova" w:cs="Proxima Nova"/>
+                                <w:color w:val="20212C"/>
+                                <w:sz w:val="24"/>
+                              </w:rPr>
+                              <w:t>2</w:t>
+                            </w:r>
+                            <w:r>
+                              <w:rPr>
+                                <w:rFonts w:ascii="Proxima Nova" w:eastAsia="Proxima Nova" w:hAnsi="Proxima Nova" w:cs="Proxima Nova"/>
+                                <w:color w:val="20212C"/>
+                                <w:sz w:val="24"/>
+                              </w:rPr>
+                              <w:t>/0</w:t>
+                            </w:r>
+                            <w:r>
+                              <w:rPr>
+                                <w:rFonts w:ascii="Proxima Nova" w:eastAsia="Proxima Nova" w:hAnsi="Proxima Nova" w:cs="Proxima Nova"/>
+                                <w:color w:val="20212C"/>
+                                <w:sz w:val="24"/>
+                              </w:rPr>
+                              <w:t>9</w:t>
+                            </w:r>
+                            <w:r>
+                              <w:rPr>
+                                <w:rFonts w:ascii="Proxima Nova" w:eastAsia="Proxima Nova" w:hAnsi="Proxima Nova" w:cs="Proxima Nova"/>
+                                <w:color w:val="20212C"/>
+                                <w:sz w:val="24"/>
+                              </w:rPr>
+                              <w:t>/2025</w:t>
                             </w:r>
                           </w:p>
                           <w:p>
@@ -729,7 +761,39 @@
                           <w:color w:val="20212C"/>
                           <w:sz w:val="24"/>
                         </w:rPr>
-                        <w:t xml:space="preserve"> 20/08/2025</w:t>
+                        <w:t xml:space="preserve"> 2</w:t>
+                      </w:r>
+                      <w:r>
+                        <w:rPr>
+                          <w:rFonts w:ascii="Proxima Nova" w:eastAsia="Proxima Nova" w:hAnsi="Proxima Nova" w:cs="Proxima Nova"/>
+                          <w:color w:val="20212C"/>
+                          <w:sz w:val="24"/>
+                        </w:rPr>
+                        <w:t>2</w:t>
+                      </w:r>
+                      <w:r>
+                        <w:rPr>
+                          <w:rFonts w:ascii="Proxima Nova" w:eastAsia="Proxima Nova" w:hAnsi="Proxima Nova" w:cs="Proxima Nova"/>
+                          <w:color w:val="20212C"/>
+                          <w:sz w:val="24"/>
+                        </w:rPr>
+                        <w:t>/0</w:t>
+                      </w:r>
+                      <w:r>
+                        <w:rPr>
+                          <w:rFonts w:ascii="Proxima Nova" w:eastAsia="Proxima Nova" w:hAnsi="Proxima Nova" w:cs="Proxima Nova"/>
+                          <w:color w:val="20212C"/>
+                          <w:sz w:val="24"/>
+                        </w:rPr>
+                        <w:t>9</w:t>
+                      </w:r>
+                      <w:r>
+                        <w:rPr>
+                          <w:rFonts w:ascii="Proxima Nova" w:eastAsia="Proxima Nova" w:hAnsi="Proxima Nova" w:cs="Proxima Nova"/>
+                          <w:color w:val="20212C"/>
+                          <w:sz w:val="24"/>
+                        </w:rPr>
+                        <w:t>/2025</w:t>
                       </w:r>
                     </w:p>
                     <w:p>
@@ -816,814 +880,2412 @@
         </w:rPr>
       </w:pPr>
     </w:p>
-    <w:p>
-      <w:pPr>
-        <w:pBdr>
-          <w:top w:val="nil"/>
-          <w:left w:val="nil"/>
-          <w:bottom w:val="nil"/>
-          <w:right w:val="nil"/>
-          <w:between w:val="nil"/>
-        </w:pBdr>
-        <w:tabs>
-          <w:tab w:val="left" w:pos="567"/>
-          <w:tab w:val="right" w:pos="9678"/>
-        </w:tabs>
-        <w:spacing w:before="120" w:after="120"/>
-        <w:rPr>
-          <w:rFonts w:ascii="Proxima Nova" w:eastAsia="Proxima Nova" w:hAnsi="Proxima Nova" w:cs="Proxima Nova"/>
-          <w:color w:val="1F497D"/>
-          <w:sz w:val="20"/>
-          <w:szCs w:val="20"/>
-        </w:rPr>
-      </w:pPr>
-    </w:p>
     <w:sdt>
       <w:sdtPr>
-        <w:id w:val="389983542"/>
+        <w:rPr>
+          <w:lang w:val="es-ES"/>
+        </w:rPr>
+        <w:id w:val="1406956893"/>
         <w:docPartObj>
           <w:docPartGallery w:val="Table of Contents"/>
           <w:docPartUnique/>
         </w:docPartObj>
       </w:sdtPr>
+      <w:sdtEndPr>
+        <w:rPr>
+          <w:rFonts w:ascii="Helvetica Neue" w:hAnsi="Helvetica Neue"/>
+          <w:b/>
+          <w:bCs/>
+          <w:color w:val="auto"/>
+          <w:sz w:val="22"/>
+          <w:szCs w:val="22"/>
+          <w:lang w:eastAsia="es-CL"/>
+        </w:rPr>
+      </w:sdtEndPr>
       <w:sdtContent>
         <w:p>
           <w:pPr>
-            <w:widowControl w:val="0"/>
+            <w:pStyle w:val="TtuloTDC"/>
+          </w:pPr>
+        </w:p>
+        <w:p>
+          <w:pPr>
+            <w:pStyle w:val="TDC1"/>
             <w:tabs>
-              <w:tab w:val="right" w:leader="dot" w:pos="12000"/>
+              <w:tab w:val="left" w:pos="567"/>
+              <w:tab w:val="right" w:leader="dot" w:pos="9678"/>
             </w:tabs>
-            <w:spacing w:before="60"/>
             <w:rPr>
-              <w:rFonts w:ascii="Arial" w:eastAsia="Arial" w:hAnsi="Arial" w:cs="Arial"/>
-              <w:b/>
-              <w:bCs/>
-              <w:color w:val="000000"/>
+              <w:rFonts w:asciiTheme="minorHAnsi" w:eastAsiaTheme="minorEastAsia" w:hAnsiTheme="minorHAnsi" w:cstheme="minorBidi"/>
+              <w:b w:val="0"/>
+              <w:bCs w:val="0"/>
+              <w:caps w:val="0"/>
+              <w:noProof/>
+              <w:kern w:val="2"/>
+              <w:szCs w:val="24"/>
+              <w:lang w:val="es-CL"/>
+              <w14:ligatures w14:val="standardContextual"/>
             </w:rPr>
           </w:pPr>
           <w:r>
+            <w:rPr>
+              <w:rFonts w:ascii="Proxima Nova" w:hAnsi="Proxima Nova"/>
+              <w:szCs w:val="24"/>
+            </w:rPr>
             <w:fldChar w:fldCharType="begin"/>
           </w:r>
           <w:r>
-            <w:instrText xml:space="preserve"> TOC \h \u \z \t "Heading 1,1,Heading 2,2,Heading 3,3,Heading 4,4,Heading 5,5,Heading 6,6,"</w:instrText>
+            <w:rPr>
+              <w:rFonts w:ascii="Proxima Nova" w:hAnsi="Proxima Nova"/>
+              <w:szCs w:val="24"/>
+            </w:rPr>
+            <w:instrText xml:space="preserve"> TOC \o "1-3" \h \z \u </w:instrText>
           </w:r>
           <w:r>
+            <w:rPr>
+              <w:rFonts w:ascii="Proxima Nova" w:hAnsi="Proxima Nova"/>
+              <w:szCs w:val="24"/>
+            </w:rPr>
             <w:fldChar w:fldCharType="separate"/>
           </w:r>
-          <w:hyperlink w:anchor="_heading=h.zaqqlbpohtcj">
-            <w:r>
-              <w:rPr>
-                <w:b/>
-                <w:bCs/>
-                <w:color w:val="000000"/>
-              </w:rPr>
-              <w:t>1. Introducción</w:t>
-            </w:r>
-            <w:r>
-              <w:rPr>
-                <w:b/>
-                <w:bCs/>
-                <w:color w:val="000000"/>
+          <w:hyperlink w:anchor="_Toc215668019" w:history="1">
+            <w:r>
+              <w:rPr>
+                <w:rStyle w:val="Hipervnculo"/>
+                <w:noProof/>
+              </w:rPr>
+              <w:t>1.</w:t>
+            </w:r>
+            <w:r>
+              <w:rPr>
+                <w:rFonts w:asciiTheme="minorHAnsi" w:eastAsiaTheme="minorEastAsia" w:hAnsiTheme="minorHAnsi" w:cstheme="minorBidi"/>
+                <w:b w:val="0"/>
+                <w:bCs w:val="0"/>
+                <w:caps w:val="0"/>
+                <w:noProof/>
+                <w:kern w:val="2"/>
+                <w:szCs w:val="24"/>
+                <w:lang w:val="es-CL"/>
+                <w14:ligatures w14:val="standardContextual"/>
               </w:rPr>
               <w:tab/>
+            </w:r>
+            <w:r>
+              <w:rPr>
+                <w:rStyle w:val="Hipervnculo"/>
+                <w:noProof/>
+              </w:rPr>
+              <w:t>Introducción</w:t>
+            </w:r>
+            <w:r>
+              <w:rPr>
+                <w:noProof/>
+                <w:webHidden/>
+              </w:rPr>
+              <w:tab/>
+            </w:r>
+            <w:r>
+              <w:rPr>
+                <w:noProof/>
+                <w:webHidden/>
+              </w:rPr>
+              <w:fldChar w:fldCharType="begin"/>
+            </w:r>
+            <w:r>
+              <w:rPr>
+                <w:noProof/>
+                <w:webHidden/>
+              </w:rPr>
+              <w:instrText xml:space="preserve"> PAGEREF _Toc215668019 \h </w:instrText>
+            </w:r>
+            <w:r>
+              <w:rPr>
+                <w:noProof/>
+                <w:webHidden/>
+              </w:rPr>
+            </w:r>
+            <w:r>
+              <w:rPr>
+                <w:noProof/>
+                <w:webHidden/>
+              </w:rPr>
+              <w:fldChar w:fldCharType="separate"/>
+            </w:r>
+            <w:r>
+              <w:rPr>
+                <w:noProof/>
+                <w:webHidden/>
+              </w:rPr>
               <w:t>3</w:t>
+            </w:r>
+            <w:r>
+              <w:rPr>
+                <w:noProof/>
+                <w:webHidden/>
+              </w:rPr>
+              <w:fldChar w:fldCharType="end"/>
             </w:r>
           </w:hyperlink>
         </w:p>
         <w:p>
           <w:pPr>
-            <w:widowControl w:val="0"/>
+            <w:pStyle w:val="TDC1"/>
             <w:tabs>
-              <w:tab w:val="right" w:leader="dot" w:pos="12000"/>
+              <w:tab w:val="left" w:pos="567"/>
+              <w:tab w:val="right" w:leader="dot" w:pos="9678"/>
             </w:tabs>
-            <w:spacing w:before="60"/>
             <w:rPr>
-              <w:rFonts w:ascii="Arial" w:eastAsia="Arial" w:hAnsi="Arial" w:cs="Arial"/>
-              <w:b/>
-              <w:bCs/>
-              <w:color w:val="000000"/>
+              <w:rFonts w:asciiTheme="minorHAnsi" w:eastAsiaTheme="minorEastAsia" w:hAnsiTheme="minorHAnsi" w:cstheme="minorBidi"/>
+              <w:b w:val="0"/>
+              <w:bCs w:val="0"/>
+              <w:caps w:val="0"/>
+              <w:noProof/>
+              <w:kern w:val="2"/>
+              <w:szCs w:val="24"/>
+              <w:lang w:val="es-CL"/>
+              <w14:ligatures w14:val="standardContextual"/>
             </w:rPr>
           </w:pPr>
-          <w:hyperlink w:anchor="_heading=h.vxbc3iw7uoy">
-            <w:r>
-              <w:rPr>
-                <w:b/>
-                <w:bCs/>
-                <w:color w:val="000000"/>
-              </w:rPr>
-              <w:t>2. Datos del documento</w:t>
-            </w:r>
-            <w:r>
-              <w:rPr>
-                <w:b/>
-                <w:bCs/>
-                <w:color w:val="000000"/>
+          <w:hyperlink w:anchor="_Toc215668020" w:history="1">
+            <w:r>
+              <w:rPr>
+                <w:rStyle w:val="Hipervnculo"/>
+                <w:noProof/>
+              </w:rPr>
+              <w:t>2.</w:t>
+            </w:r>
+            <w:r>
+              <w:rPr>
+                <w:rFonts w:asciiTheme="minorHAnsi" w:eastAsiaTheme="minorEastAsia" w:hAnsiTheme="minorHAnsi" w:cstheme="minorBidi"/>
+                <w:b w:val="0"/>
+                <w:bCs w:val="0"/>
+                <w:caps w:val="0"/>
+                <w:noProof/>
+                <w:kern w:val="2"/>
+                <w:szCs w:val="24"/>
+                <w:lang w:val="es-CL"/>
+                <w14:ligatures w14:val="standardContextual"/>
               </w:rPr>
               <w:tab/>
+            </w:r>
+            <w:r>
+              <w:rPr>
+                <w:rStyle w:val="Hipervnculo"/>
+                <w:noProof/>
+              </w:rPr>
+              <w:t>Datos del documento</w:t>
+            </w:r>
+            <w:r>
+              <w:rPr>
+                <w:noProof/>
+                <w:webHidden/>
+              </w:rPr>
+              <w:tab/>
+            </w:r>
+            <w:r>
+              <w:rPr>
+                <w:noProof/>
+                <w:webHidden/>
+              </w:rPr>
+              <w:fldChar w:fldCharType="begin"/>
+            </w:r>
+            <w:r>
+              <w:rPr>
+                <w:noProof/>
+                <w:webHidden/>
+              </w:rPr>
+              <w:instrText xml:space="preserve"> PAGEREF _Toc215668020 \h </w:instrText>
+            </w:r>
+            <w:r>
+              <w:rPr>
+                <w:noProof/>
+                <w:webHidden/>
+              </w:rPr>
+            </w:r>
+            <w:r>
+              <w:rPr>
+                <w:noProof/>
+                <w:webHidden/>
+              </w:rPr>
+              <w:fldChar w:fldCharType="separate"/>
+            </w:r>
+            <w:r>
+              <w:rPr>
+                <w:noProof/>
+                <w:webHidden/>
+              </w:rPr>
               <w:t>3</w:t>
+            </w:r>
+            <w:r>
+              <w:rPr>
+                <w:noProof/>
+                <w:webHidden/>
+              </w:rPr>
+              <w:fldChar w:fldCharType="end"/>
             </w:r>
           </w:hyperlink>
         </w:p>
         <w:p>
           <w:pPr>
-            <w:widowControl w:val="0"/>
+            <w:pStyle w:val="TDC2"/>
             <w:tabs>
-              <w:tab w:val="right" w:leader="dot" w:pos="12000"/>
+              <w:tab w:val="left" w:pos="1100"/>
+              <w:tab w:val="right" w:leader="dot" w:pos="9678"/>
             </w:tabs>
-            <w:spacing w:before="60"/>
-            <w:ind w:left="360"/>
             <w:rPr>
-              <w:rFonts w:ascii="Arial" w:eastAsia="Arial" w:hAnsi="Arial" w:cs="Arial"/>
-              <w:color w:val="000000"/>
+              <w:rFonts w:asciiTheme="minorHAnsi" w:eastAsiaTheme="minorEastAsia" w:hAnsiTheme="minorHAnsi" w:cstheme="minorBidi"/>
+              <w:b w:val="0"/>
+              <w:smallCaps w:val="0"/>
+              <w:noProof/>
+              <w:kern w:val="2"/>
+              <w:szCs w:val="24"/>
+              <w:lang w:val="es-CL"/>
+              <w14:ligatures w14:val="standardContextual"/>
             </w:rPr>
           </w:pPr>
-          <w:hyperlink w:anchor="_heading=h.xs5y54s10hqp">
-            <w:r>
-              <w:rPr>
-                <w:color w:val="000000"/>
-              </w:rPr>
-              <w:t>2.1. Histórico de Revisiones</w:t>
-            </w:r>
-            <w:r>
-              <w:rPr>
-                <w:color w:val="000000"/>
+          <w:hyperlink w:anchor="_Toc215668021" w:history="1">
+            <w:r>
+              <w:rPr>
+                <w:rStyle w:val="Hipervnculo"/>
+                <w:noProof/>
+              </w:rPr>
+              <w:t>2.1.</w:t>
+            </w:r>
+            <w:r>
+              <w:rPr>
+                <w:rFonts w:asciiTheme="minorHAnsi" w:eastAsiaTheme="minorEastAsia" w:hAnsiTheme="minorHAnsi" w:cstheme="minorBidi"/>
+                <w:b w:val="0"/>
+                <w:smallCaps w:val="0"/>
+                <w:noProof/>
+                <w:kern w:val="2"/>
+                <w:szCs w:val="24"/>
+                <w:lang w:val="es-CL"/>
+                <w14:ligatures w14:val="standardContextual"/>
               </w:rPr>
               <w:tab/>
+            </w:r>
+            <w:r>
+              <w:rPr>
+                <w:rStyle w:val="Hipervnculo"/>
+                <w:rFonts w:ascii="Proxima Nova" w:eastAsia="Proxima Nova" w:hAnsi="Proxima Nova" w:cs="Proxima Nova"/>
+                <w:noProof/>
+              </w:rPr>
+              <w:t>Histórico de Revisiones</w:t>
+            </w:r>
+            <w:r>
+              <w:rPr>
+                <w:noProof/>
+                <w:webHidden/>
+              </w:rPr>
+              <w:tab/>
+            </w:r>
+            <w:r>
+              <w:rPr>
+                <w:noProof/>
+                <w:webHidden/>
+              </w:rPr>
+              <w:fldChar w:fldCharType="begin"/>
+            </w:r>
+            <w:r>
+              <w:rPr>
+                <w:noProof/>
+                <w:webHidden/>
+              </w:rPr>
+              <w:instrText xml:space="preserve"> PAGEREF _Toc215668021 \h </w:instrText>
+            </w:r>
+            <w:r>
+              <w:rPr>
+                <w:noProof/>
+                <w:webHidden/>
+              </w:rPr>
+            </w:r>
+            <w:r>
+              <w:rPr>
+                <w:noProof/>
+                <w:webHidden/>
+              </w:rPr>
+              <w:fldChar w:fldCharType="separate"/>
+            </w:r>
+            <w:r>
+              <w:rPr>
+                <w:noProof/>
+                <w:webHidden/>
+              </w:rPr>
               <w:t>3</w:t>
+            </w:r>
+            <w:r>
+              <w:rPr>
+                <w:noProof/>
+                <w:webHidden/>
+              </w:rPr>
+              <w:fldChar w:fldCharType="end"/>
             </w:r>
           </w:hyperlink>
         </w:p>
         <w:p>
           <w:pPr>
-            <w:widowControl w:val="0"/>
+            <w:pStyle w:val="TDC2"/>
             <w:tabs>
-              <w:tab w:val="right" w:leader="dot" w:pos="12000"/>
+              <w:tab w:val="left" w:pos="1100"/>
+              <w:tab w:val="right" w:leader="dot" w:pos="9678"/>
             </w:tabs>
-            <w:spacing w:before="60"/>
-            <w:ind w:left="360"/>
             <w:rPr>
-              <w:rFonts w:ascii="Arial" w:eastAsia="Arial" w:hAnsi="Arial" w:cs="Arial"/>
-              <w:color w:val="000000"/>
+              <w:rFonts w:asciiTheme="minorHAnsi" w:eastAsiaTheme="minorEastAsia" w:hAnsiTheme="minorHAnsi" w:cstheme="minorBidi"/>
+              <w:b w:val="0"/>
+              <w:smallCaps w:val="0"/>
+              <w:noProof/>
+              <w:kern w:val="2"/>
+              <w:szCs w:val="24"/>
+              <w:lang w:val="es-CL"/>
+              <w14:ligatures w14:val="standardContextual"/>
             </w:rPr>
           </w:pPr>
-          <w:hyperlink w:anchor="_heading=h.lzhi6m8fos9u">
-            <w:r>
-              <w:rPr>
-                <w:color w:val="000000"/>
-              </w:rPr>
-              <w:t>2.2. Información del Proyecto</w:t>
-            </w:r>
-            <w:r>
-              <w:rPr>
-                <w:color w:val="000000"/>
+          <w:hyperlink w:anchor="_Toc215668022" w:history="1">
+            <w:r>
+              <w:rPr>
+                <w:rStyle w:val="Hipervnculo"/>
+                <w:rFonts w:ascii="Proxima Nova" w:eastAsia="Proxima Nova" w:hAnsi="Proxima Nova" w:cs="Proxima Nova"/>
+                <w:noProof/>
+              </w:rPr>
+              <w:t>2.2.</w:t>
+            </w:r>
+            <w:r>
+              <w:rPr>
+                <w:rFonts w:asciiTheme="minorHAnsi" w:eastAsiaTheme="minorEastAsia" w:hAnsiTheme="minorHAnsi" w:cstheme="minorBidi"/>
+                <w:b w:val="0"/>
+                <w:smallCaps w:val="0"/>
+                <w:noProof/>
+                <w:kern w:val="2"/>
+                <w:szCs w:val="24"/>
+                <w:lang w:val="es-CL"/>
+                <w14:ligatures w14:val="standardContextual"/>
               </w:rPr>
               <w:tab/>
+            </w:r>
+            <w:r>
+              <w:rPr>
+                <w:rStyle w:val="Hipervnculo"/>
+                <w:rFonts w:ascii="Proxima Nova" w:eastAsia="Proxima Nova" w:hAnsi="Proxima Nova" w:cs="Proxima Nova"/>
+                <w:noProof/>
+              </w:rPr>
+              <w:t>Información del Proyecto</w:t>
+            </w:r>
+            <w:r>
+              <w:rPr>
+                <w:noProof/>
+                <w:webHidden/>
+              </w:rPr>
+              <w:tab/>
+            </w:r>
+            <w:r>
+              <w:rPr>
+                <w:noProof/>
+                <w:webHidden/>
+              </w:rPr>
+              <w:fldChar w:fldCharType="begin"/>
+            </w:r>
+            <w:r>
+              <w:rPr>
+                <w:noProof/>
+                <w:webHidden/>
+              </w:rPr>
+              <w:instrText xml:space="preserve"> PAGEREF _Toc215668022 \h </w:instrText>
+            </w:r>
+            <w:r>
+              <w:rPr>
+                <w:noProof/>
+                <w:webHidden/>
+              </w:rPr>
+            </w:r>
+            <w:r>
+              <w:rPr>
+                <w:noProof/>
+                <w:webHidden/>
+              </w:rPr>
+              <w:fldChar w:fldCharType="separate"/>
+            </w:r>
+            <w:r>
+              <w:rPr>
+                <w:noProof/>
+                <w:webHidden/>
+              </w:rPr>
               <w:t>3</w:t>
+            </w:r>
+            <w:r>
+              <w:rPr>
+                <w:noProof/>
+                <w:webHidden/>
+              </w:rPr>
+              <w:fldChar w:fldCharType="end"/>
             </w:r>
           </w:hyperlink>
         </w:p>
         <w:p>
           <w:pPr>
-            <w:widowControl w:val="0"/>
+            <w:pStyle w:val="TDC2"/>
             <w:tabs>
-              <w:tab w:val="right" w:leader="dot" w:pos="12000"/>
+              <w:tab w:val="left" w:pos="1100"/>
+              <w:tab w:val="right" w:leader="dot" w:pos="9678"/>
             </w:tabs>
-            <w:spacing w:before="60"/>
-            <w:ind w:left="360"/>
             <w:rPr>
-              <w:rFonts w:ascii="Arial" w:eastAsia="Arial" w:hAnsi="Arial" w:cs="Arial"/>
-              <w:color w:val="000000"/>
+              <w:rFonts w:asciiTheme="minorHAnsi" w:eastAsiaTheme="minorEastAsia" w:hAnsiTheme="minorHAnsi" w:cstheme="minorBidi"/>
+              <w:b w:val="0"/>
+              <w:smallCaps w:val="0"/>
+              <w:noProof/>
+              <w:kern w:val="2"/>
+              <w:szCs w:val="24"/>
+              <w:lang w:val="es-CL"/>
+              <w14:ligatures w14:val="standardContextual"/>
             </w:rPr>
           </w:pPr>
-          <w:hyperlink w:anchor="_heading=h.5ucrh5wn1okx">
-            <w:r>
-              <w:rPr>
-                <w:color w:val="000000"/>
-              </w:rPr>
-              <w:t>2.3. Integrantes</w:t>
-            </w:r>
-            <w:r>
-              <w:rPr>
-                <w:color w:val="000000"/>
+          <w:hyperlink w:anchor="_Toc215668023" w:history="1">
+            <w:r>
+              <w:rPr>
+                <w:rStyle w:val="Hipervnculo"/>
+                <w:rFonts w:ascii="Proxima Nova" w:eastAsia="Proxima Nova" w:hAnsi="Proxima Nova" w:cs="Proxima Nova"/>
+                <w:noProof/>
+              </w:rPr>
+              <w:t>2.3.</w:t>
+            </w:r>
+            <w:r>
+              <w:rPr>
+                <w:rFonts w:asciiTheme="minorHAnsi" w:eastAsiaTheme="minorEastAsia" w:hAnsiTheme="minorHAnsi" w:cstheme="minorBidi"/>
+                <w:b w:val="0"/>
+                <w:smallCaps w:val="0"/>
+                <w:noProof/>
+                <w:kern w:val="2"/>
+                <w:szCs w:val="24"/>
+                <w:lang w:val="es-CL"/>
+                <w14:ligatures w14:val="standardContextual"/>
               </w:rPr>
               <w:tab/>
+            </w:r>
+            <w:r>
+              <w:rPr>
+                <w:rStyle w:val="Hipervnculo"/>
+                <w:rFonts w:ascii="Proxima Nova" w:eastAsia="Proxima Nova" w:hAnsi="Proxima Nova" w:cs="Proxima Nova"/>
+                <w:noProof/>
+              </w:rPr>
+              <w:t>Integrantes</w:t>
+            </w:r>
+            <w:r>
+              <w:rPr>
+                <w:noProof/>
+                <w:webHidden/>
+              </w:rPr>
+              <w:tab/>
+            </w:r>
+            <w:r>
+              <w:rPr>
+                <w:noProof/>
+                <w:webHidden/>
+              </w:rPr>
+              <w:fldChar w:fldCharType="begin"/>
+            </w:r>
+            <w:r>
+              <w:rPr>
+                <w:noProof/>
+                <w:webHidden/>
+              </w:rPr>
+              <w:instrText xml:space="preserve"> PAGEREF _Toc215668023 \h </w:instrText>
+            </w:r>
+            <w:r>
+              <w:rPr>
+                <w:noProof/>
+                <w:webHidden/>
+              </w:rPr>
+            </w:r>
+            <w:r>
+              <w:rPr>
+                <w:noProof/>
+                <w:webHidden/>
+              </w:rPr>
+              <w:fldChar w:fldCharType="separate"/>
+            </w:r>
+            <w:r>
+              <w:rPr>
+                <w:noProof/>
+                <w:webHidden/>
+              </w:rPr>
               <w:t>3</w:t>
+            </w:r>
+            <w:r>
+              <w:rPr>
+                <w:noProof/>
+                <w:webHidden/>
+              </w:rPr>
+              <w:fldChar w:fldCharType="end"/>
             </w:r>
           </w:hyperlink>
         </w:p>
         <w:p>
           <w:pPr>
-            <w:widowControl w:val="0"/>
+            <w:pStyle w:val="TDC1"/>
             <w:tabs>
-              <w:tab w:val="right" w:leader="dot" w:pos="12000"/>
+              <w:tab w:val="left" w:pos="567"/>
+              <w:tab w:val="right" w:leader="dot" w:pos="9678"/>
             </w:tabs>
-            <w:spacing w:before="60"/>
             <w:rPr>
-              <w:rFonts w:ascii="Arial" w:eastAsia="Arial" w:hAnsi="Arial" w:cs="Arial"/>
-              <w:b/>
-              <w:bCs/>
-              <w:color w:val="000000"/>
+              <w:rFonts w:asciiTheme="minorHAnsi" w:eastAsiaTheme="minorEastAsia" w:hAnsiTheme="minorHAnsi" w:cstheme="minorBidi"/>
+              <w:b w:val="0"/>
+              <w:bCs w:val="0"/>
+              <w:caps w:val="0"/>
+              <w:noProof/>
+              <w:kern w:val="2"/>
+              <w:szCs w:val="24"/>
+              <w:lang w:val="es-CL"/>
+              <w14:ligatures w14:val="standardContextual"/>
             </w:rPr>
           </w:pPr>
-          <w:hyperlink w:anchor="_heading=h.91h7nijy7v01">
-            <w:r>
-              <w:rPr>
-                <w:b/>
-                <w:bCs/>
-                <w:color w:val="000000"/>
-              </w:rPr>
-              <w:t>3. Información del Proyecto</w:t>
-            </w:r>
-            <w:r>
-              <w:rPr>
-                <w:b/>
-                <w:bCs/>
-                <w:color w:val="000000"/>
+          <w:hyperlink w:anchor="_Toc215668024" w:history="1">
+            <w:r>
+              <w:rPr>
+                <w:rStyle w:val="Hipervnculo"/>
+                <w:noProof/>
+              </w:rPr>
+              <w:t>3.</w:t>
+            </w:r>
+            <w:r>
+              <w:rPr>
+                <w:rFonts w:asciiTheme="minorHAnsi" w:eastAsiaTheme="minorEastAsia" w:hAnsiTheme="minorHAnsi" w:cstheme="minorBidi"/>
+                <w:b w:val="0"/>
+                <w:bCs w:val="0"/>
+                <w:caps w:val="0"/>
+                <w:noProof/>
+                <w:kern w:val="2"/>
+                <w:szCs w:val="24"/>
+                <w:lang w:val="es-CL"/>
+                <w14:ligatures w14:val="standardContextual"/>
               </w:rPr>
               <w:tab/>
-              <w:t>5</w:t>
+            </w:r>
+            <w:r>
+              <w:rPr>
+                <w:rStyle w:val="Hipervnculo"/>
+                <w:noProof/>
+              </w:rPr>
+              <w:t>Información del Proyecto</w:t>
+            </w:r>
+            <w:r>
+              <w:rPr>
+                <w:noProof/>
+                <w:webHidden/>
+              </w:rPr>
+              <w:tab/>
+            </w:r>
+            <w:r>
+              <w:rPr>
+                <w:noProof/>
+                <w:webHidden/>
+              </w:rPr>
+              <w:fldChar w:fldCharType="begin"/>
+            </w:r>
+            <w:r>
+              <w:rPr>
+                <w:noProof/>
+                <w:webHidden/>
+              </w:rPr>
+              <w:instrText xml:space="preserve"> PAGEREF _Toc215668024 \h </w:instrText>
+            </w:r>
+            <w:r>
+              <w:rPr>
+                <w:noProof/>
+                <w:webHidden/>
+              </w:rPr>
+            </w:r>
+            <w:r>
+              <w:rPr>
+                <w:noProof/>
+                <w:webHidden/>
+              </w:rPr>
+              <w:fldChar w:fldCharType="separate"/>
+            </w:r>
+            <w:r>
+              <w:rPr>
+                <w:noProof/>
+                <w:webHidden/>
+              </w:rPr>
+              <w:t>4</w:t>
+            </w:r>
+            <w:r>
+              <w:rPr>
+                <w:noProof/>
+                <w:webHidden/>
+              </w:rPr>
+              <w:fldChar w:fldCharType="end"/>
             </w:r>
           </w:hyperlink>
         </w:p>
         <w:p>
           <w:pPr>
-            <w:widowControl w:val="0"/>
+            <w:pStyle w:val="TDC1"/>
             <w:tabs>
-              <w:tab w:val="right" w:leader="dot" w:pos="12000"/>
+              <w:tab w:val="left" w:pos="567"/>
+              <w:tab w:val="right" w:leader="dot" w:pos="9678"/>
             </w:tabs>
-            <w:spacing w:before="60"/>
             <w:rPr>
-              <w:rFonts w:ascii="Arial" w:eastAsia="Arial" w:hAnsi="Arial" w:cs="Arial"/>
-              <w:b/>
-              <w:bCs/>
-              <w:color w:val="000000"/>
+              <w:rFonts w:asciiTheme="minorHAnsi" w:eastAsiaTheme="minorEastAsia" w:hAnsiTheme="minorHAnsi" w:cstheme="minorBidi"/>
+              <w:b w:val="0"/>
+              <w:bCs w:val="0"/>
+              <w:caps w:val="0"/>
+              <w:noProof/>
+              <w:kern w:val="2"/>
+              <w:szCs w:val="24"/>
+              <w:lang w:val="es-CL"/>
+              <w14:ligatures w14:val="standardContextual"/>
             </w:rPr>
           </w:pPr>
-          <w:hyperlink w:anchor="_heading=h.fq3r34mfa3hl">
-            <w:r>
-              <w:rPr>
-                <w:b/>
-                <w:bCs/>
-                <w:color w:val="000000"/>
-              </w:rPr>
-              <w:t>4. Propósito del plan de proyecto</w:t>
-            </w:r>
-            <w:r>
-              <w:rPr>
-                <w:b/>
-                <w:bCs/>
-                <w:color w:val="000000"/>
+          <w:hyperlink w:anchor="_Toc215668025" w:history="1">
+            <w:r>
+              <w:rPr>
+                <w:rStyle w:val="Hipervnculo"/>
+                <w:noProof/>
+              </w:rPr>
+              <w:t>4.</w:t>
+            </w:r>
+            <w:r>
+              <w:rPr>
+                <w:rFonts w:asciiTheme="minorHAnsi" w:eastAsiaTheme="minorEastAsia" w:hAnsiTheme="minorHAnsi" w:cstheme="minorBidi"/>
+                <w:b w:val="0"/>
+                <w:bCs w:val="0"/>
+                <w:caps w:val="0"/>
+                <w:noProof/>
+                <w:kern w:val="2"/>
+                <w:szCs w:val="24"/>
+                <w:lang w:val="es-CL"/>
+                <w14:ligatures w14:val="standardContextual"/>
               </w:rPr>
               <w:tab/>
-              <w:t>5</w:t>
+            </w:r>
+            <w:r>
+              <w:rPr>
+                <w:rStyle w:val="Hipervnculo"/>
+                <w:noProof/>
+              </w:rPr>
+              <w:t>Propósito del plan de proyecto</w:t>
+            </w:r>
+            <w:r>
+              <w:rPr>
+                <w:noProof/>
+                <w:webHidden/>
+              </w:rPr>
+              <w:tab/>
+            </w:r>
+            <w:r>
+              <w:rPr>
+                <w:noProof/>
+                <w:webHidden/>
+              </w:rPr>
+              <w:fldChar w:fldCharType="begin"/>
+            </w:r>
+            <w:r>
+              <w:rPr>
+                <w:noProof/>
+                <w:webHidden/>
+              </w:rPr>
+              <w:instrText xml:space="preserve"> PAGEREF _Toc215668025 \h </w:instrText>
+            </w:r>
+            <w:r>
+              <w:rPr>
+                <w:noProof/>
+                <w:webHidden/>
+              </w:rPr>
+            </w:r>
+            <w:r>
+              <w:rPr>
+                <w:noProof/>
+                <w:webHidden/>
+              </w:rPr>
+              <w:fldChar w:fldCharType="separate"/>
+            </w:r>
+            <w:r>
+              <w:rPr>
+                <w:noProof/>
+                <w:webHidden/>
+              </w:rPr>
+              <w:t>4</w:t>
+            </w:r>
+            <w:r>
+              <w:rPr>
+                <w:noProof/>
+                <w:webHidden/>
+              </w:rPr>
+              <w:fldChar w:fldCharType="end"/>
             </w:r>
           </w:hyperlink>
         </w:p>
         <w:p>
           <w:pPr>
-            <w:widowControl w:val="0"/>
+            <w:pStyle w:val="TDC1"/>
             <w:tabs>
-              <w:tab w:val="right" w:leader="dot" w:pos="12000"/>
+              <w:tab w:val="left" w:pos="567"/>
+              <w:tab w:val="right" w:leader="dot" w:pos="9678"/>
             </w:tabs>
-            <w:spacing w:before="60"/>
             <w:rPr>
-              <w:rFonts w:ascii="Arial" w:eastAsia="Arial" w:hAnsi="Arial" w:cs="Arial"/>
-              <w:b/>
-              <w:bCs/>
-              <w:color w:val="000000"/>
+              <w:rFonts w:asciiTheme="minorHAnsi" w:eastAsiaTheme="minorEastAsia" w:hAnsiTheme="minorHAnsi" w:cstheme="minorBidi"/>
+              <w:b w:val="0"/>
+              <w:bCs w:val="0"/>
+              <w:caps w:val="0"/>
+              <w:noProof/>
+              <w:kern w:val="2"/>
+              <w:szCs w:val="24"/>
+              <w:lang w:val="es-CL"/>
+              <w14:ligatures w14:val="standardContextual"/>
             </w:rPr>
           </w:pPr>
-          <w:hyperlink w:anchor="_heading=h.sygqjjdoioo5">
-            <w:r>
-              <w:rPr>
-                <w:b/>
-                <w:bCs/>
-                <w:color w:val="000000"/>
-              </w:rPr>
-              <w:t>5. Visión del Proyecto Scrum</w:t>
-            </w:r>
-            <w:r>
-              <w:rPr>
-                <w:b/>
-                <w:bCs/>
-                <w:color w:val="000000"/>
+          <w:hyperlink w:anchor="_Toc215668026" w:history="1">
+            <w:r>
+              <w:rPr>
+                <w:rStyle w:val="Hipervnculo"/>
+                <w:noProof/>
+              </w:rPr>
+              <w:t>5.</w:t>
+            </w:r>
+            <w:r>
+              <w:rPr>
+                <w:rFonts w:asciiTheme="minorHAnsi" w:eastAsiaTheme="minorEastAsia" w:hAnsiTheme="minorHAnsi" w:cstheme="minorBidi"/>
+                <w:b w:val="0"/>
+                <w:bCs w:val="0"/>
+                <w:caps w:val="0"/>
+                <w:noProof/>
+                <w:kern w:val="2"/>
+                <w:szCs w:val="24"/>
+                <w:lang w:val="es-CL"/>
+                <w14:ligatures w14:val="standardContextual"/>
               </w:rPr>
               <w:tab/>
-              <w:t>5</w:t>
+            </w:r>
+            <w:r>
+              <w:rPr>
+                <w:rStyle w:val="Hipervnculo"/>
+                <w:noProof/>
+              </w:rPr>
+              <w:t>Visión del Proyecto Scrum</w:t>
+            </w:r>
+            <w:r>
+              <w:rPr>
+                <w:noProof/>
+                <w:webHidden/>
+              </w:rPr>
+              <w:tab/>
+            </w:r>
+            <w:r>
+              <w:rPr>
+                <w:noProof/>
+                <w:webHidden/>
+              </w:rPr>
+              <w:fldChar w:fldCharType="begin"/>
+            </w:r>
+            <w:r>
+              <w:rPr>
+                <w:noProof/>
+                <w:webHidden/>
+              </w:rPr>
+              <w:instrText xml:space="preserve"> PAGEREF _Toc215668026 \h </w:instrText>
+            </w:r>
+            <w:r>
+              <w:rPr>
+                <w:noProof/>
+                <w:webHidden/>
+              </w:rPr>
+            </w:r>
+            <w:r>
+              <w:rPr>
+                <w:noProof/>
+                <w:webHidden/>
+              </w:rPr>
+              <w:fldChar w:fldCharType="separate"/>
+            </w:r>
+            <w:r>
+              <w:rPr>
+                <w:noProof/>
+                <w:webHidden/>
+              </w:rPr>
+              <w:t>4</w:t>
+            </w:r>
+            <w:r>
+              <w:rPr>
+                <w:noProof/>
+                <w:webHidden/>
+              </w:rPr>
+              <w:fldChar w:fldCharType="end"/>
             </w:r>
           </w:hyperlink>
         </w:p>
         <w:p>
           <w:pPr>
-            <w:widowControl w:val="0"/>
+            <w:pStyle w:val="TDC1"/>
             <w:tabs>
-              <w:tab w:val="right" w:leader="dot" w:pos="12000"/>
+              <w:tab w:val="left" w:pos="567"/>
+              <w:tab w:val="right" w:leader="dot" w:pos="9678"/>
             </w:tabs>
-            <w:spacing w:before="60"/>
             <w:rPr>
-              <w:rFonts w:ascii="Arial" w:eastAsia="Arial" w:hAnsi="Arial" w:cs="Arial"/>
-              <w:b/>
-              <w:bCs/>
-              <w:color w:val="000000"/>
+              <w:rFonts w:asciiTheme="minorHAnsi" w:eastAsiaTheme="minorEastAsia" w:hAnsiTheme="minorHAnsi" w:cstheme="minorBidi"/>
+              <w:b w:val="0"/>
+              <w:bCs w:val="0"/>
+              <w:caps w:val="0"/>
+              <w:noProof/>
+              <w:kern w:val="2"/>
+              <w:szCs w:val="24"/>
+              <w:lang w:val="es-CL"/>
+              <w14:ligatures w14:val="standardContextual"/>
             </w:rPr>
           </w:pPr>
-          <w:hyperlink w:anchor="_heading=h.3vo99y9wakvb">
-            <w:r>
-              <w:rPr>
-                <w:b/>
-                <w:bCs/>
-                <w:color w:val="000000"/>
-              </w:rPr>
-              <w:t>6. Alcance del proyecto</w:t>
-            </w:r>
-            <w:r>
-              <w:rPr>
-                <w:b/>
-                <w:bCs/>
-                <w:color w:val="000000"/>
+          <w:hyperlink w:anchor="_Toc215668027" w:history="1">
+            <w:r>
+              <w:rPr>
+                <w:rStyle w:val="Hipervnculo"/>
+                <w:noProof/>
+              </w:rPr>
+              <w:t>6.</w:t>
+            </w:r>
+            <w:r>
+              <w:rPr>
+                <w:rFonts w:asciiTheme="minorHAnsi" w:eastAsiaTheme="minorEastAsia" w:hAnsiTheme="minorHAnsi" w:cstheme="minorBidi"/>
+                <w:b w:val="0"/>
+                <w:bCs w:val="0"/>
+                <w:caps w:val="0"/>
+                <w:noProof/>
+                <w:kern w:val="2"/>
+                <w:szCs w:val="24"/>
+                <w:lang w:val="es-CL"/>
+                <w14:ligatures w14:val="standardContextual"/>
               </w:rPr>
               <w:tab/>
-              <w:t>5</w:t>
+            </w:r>
+            <w:r>
+              <w:rPr>
+                <w:rStyle w:val="Hipervnculo"/>
+                <w:noProof/>
+              </w:rPr>
+              <w:t>Alcance del proyecto</w:t>
+            </w:r>
+            <w:r>
+              <w:rPr>
+                <w:noProof/>
+                <w:webHidden/>
+              </w:rPr>
+              <w:tab/>
+            </w:r>
+            <w:r>
+              <w:rPr>
+                <w:noProof/>
+                <w:webHidden/>
+              </w:rPr>
+              <w:fldChar w:fldCharType="begin"/>
+            </w:r>
+            <w:r>
+              <w:rPr>
+                <w:noProof/>
+                <w:webHidden/>
+              </w:rPr>
+              <w:instrText xml:space="preserve"> PAGEREF _Toc215668027 \h </w:instrText>
+            </w:r>
+            <w:r>
+              <w:rPr>
+                <w:noProof/>
+                <w:webHidden/>
+              </w:rPr>
+            </w:r>
+            <w:r>
+              <w:rPr>
+                <w:noProof/>
+                <w:webHidden/>
+              </w:rPr>
+              <w:fldChar w:fldCharType="separate"/>
+            </w:r>
+            <w:r>
+              <w:rPr>
+                <w:noProof/>
+                <w:webHidden/>
+              </w:rPr>
+              <w:t>4</w:t>
+            </w:r>
+            <w:r>
+              <w:rPr>
+                <w:noProof/>
+                <w:webHidden/>
+              </w:rPr>
+              <w:fldChar w:fldCharType="end"/>
             </w:r>
           </w:hyperlink>
         </w:p>
         <w:p>
           <w:pPr>
-            <w:widowControl w:val="0"/>
+            <w:pStyle w:val="TDC1"/>
             <w:tabs>
-              <w:tab w:val="right" w:leader="dot" w:pos="12000"/>
+              <w:tab w:val="left" w:pos="567"/>
+              <w:tab w:val="right" w:leader="dot" w:pos="9678"/>
             </w:tabs>
-            <w:spacing w:before="60"/>
             <w:rPr>
-              <w:rFonts w:ascii="Arial" w:eastAsia="Arial" w:hAnsi="Arial" w:cs="Arial"/>
-              <w:b/>
-              <w:bCs/>
-              <w:color w:val="000000"/>
+              <w:rFonts w:asciiTheme="minorHAnsi" w:eastAsiaTheme="minorEastAsia" w:hAnsiTheme="minorHAnsi" w:cstheme="minorBidi"/>
+              <w:b w:val="0"/>
+              <w:bCs w:val="0"/>
+              <w:caps w:val="0"/>
+              <w:noProof/>
+              <w:kern w:val="2"/>
+              <w:szCs w:val="24"/>
+              <w:lang w:val="es-CL"/>
+              <w14:ligatures w14:val="standardContextual"/>
             </w:rPr>
           </w:pPr>
-          <w:hyperlink w:anchor="_heading=h.d3dpoxcrlp2p">
-            <w:r>
-              <w:rPr>
-                <w:b/>
-                <w:bCs/>
-                <w:color w:val="000000"/>
-              </w:rPr>
-              <w:t>7. Metodología de desarrollo</w:t>
-            </w:r>
-            <w:r>
-              <w:rPr>
-                <w:b/>
-                <w:bCs/>
-                <w:color w:val="000000"/>
+          <w:hyperlink w:anchor="_Toc215668028" w:history="1">
+            <w:r>
+              <w:rPr>
+                <w:rStyle w:val="Hipervnculo"/>
+                <w:noProof/>
+              </w:rPr>
+              <w:t>7.</w:t>
+            </w:r>
+            <w:r>
+              <w:rPr>
+                <w:rFonts w:asciiTheme="minorHAnsi" w:eastAsiaTheme="minorEastAsia" w:hAnsiTheme="minorHAnsi" w:cstheme="minorBidi"/>
+                <w:b w:val="0"/>
+                <w:bCs w:val="0"/>
+                <w:caps w:val="0"/>
+                <w:noProof/>
+                <w:kern w:val="2"/>
+                <w:szCs w:val="24"/>
+                <w:lang w:val="es-CL"/>
+                <w14:ligatures w14:val="standardContextual"/>
               </w:rPr>
               <w:tab/>
-              <w:t>6</w:t>
+            </w:r>
+            <w:r>
+              <w:rPr>
+                <w:rStyle w:val="Hipervnculo"/>
+                <w:noProof/>
+              </w:rPr>
+              <w:t>Metodología de desarrollo</w:t>
+            </w:r>
+            <w:r>
+              <w:rPr>
+                <w:noProof/>
+                <w:webHidden/>
+              </w:rPr>
+              <w:tab/>
+            </w:r>
+            <w:r>
+              <w:rPr>
+                <w:noProof/>
+                <w:webHidden/>
+              </w:rPr>
+              <w:fldChar w:fldCharType="begin"/>
+            </w:r>
+            <w:r>
+              <w:rPr>
+                <w:noProof/>
+                <w:webHidden/>
+              </w:rPr>
+              <w:instrText xml:space="preserve"> PAGEREF _Toc215668028 \h </w:instrText>
+            </w:r>
+            <w:r>
+              <w:rPr>
+                <w:noProof/>
+                <w:webHidden/>
+              </w:rPr>
+            </w:r>
+            <w:r>
+              <w:rPr>
+                <w:noProof/>
+                <w:webHidden/>
+              </w:rPr>
+              <w:fldChar w:fldCharType="separate"/>
+            </w:r>
+            <w:r>
+              <w:rPr>
+                <w:noProof/>
+                <w:webHidden/>
+              </w:rPr>
+              <w:t>5</w:t>
+            </w:r>
+            <w:r>
+              <w:rPr>
+                <w:noProof/>
+                <w:webHidden/>
+              </w:rPr>
+              <w:fldChar w:fldCharType="end"/>
             </w:r>
           </w:hyperlink>
         </w:p>
         <w:p>
           <w:pPr>
-            <w:widowControl w:val="0"/>
+            <w:pStyle w:val="TDC1"/>
             <w:tabs>
-              <w:tab w:val="right" w:leader="dot" w:pos="12000"/>
+              <w:tab w:val="left" w:pos="567"/>
+              <w:tab w:val="right" w:leader="dot" w:pos="9678"/>
             </w:tabs>
-            <w:spacing w:before="60"/>
             <w:rPr>
-              <w:rFonts w:ascii="Arial" w:eastAsia="Arial" w:hAnsi="Arial" w:cs="Arial"/>
-              <w:b/>
-              <w:bCs/>
-              <w:color w:val="000000"/>
+              <w:rFonts w:asciiTheme="minorHAnsi" w:eastAsiaTheme="minorEastAsia" w:hAnsiTheme="minorHAnsi" w:cstheme="minorBidi"/>
+              <w:b w:val="0"/>
+              <w:bCs w:val="0"/>
+              <w:caps w:val="0"/>
+              <w:noProof/>
+              <w:kern w:val="2"/>
+              <w:szCs w:val="24"/>
+              <w:lang w:val="es-CL"/>
+              <w14:ligatures w14:val="standardContextual"/>
             </w:rPr>
           </w:pPr>
-          <w:hyperlink w:anchor="_heading=h.9d74taimgz59">
-            <w:r>
-              <w:rPr>
-                <w:b/>
-                <w:bCs/>
-                <w:color w:val="000000"/>
-              </w:rPr>
-              <w:t>8. Definición de Roles y responsabilidades</w:t>
-            </w:r>
-            <w:r>
-              <w:rPr>
-                <w:b/>
-                <w:bCs/>
-                <w:color w:val="000000"/>
+          <w:hyperlink w:anchor="_Toc215668029" w:history="1">
+            <w:r>
+              <w:rPr>
+                <w:rStyle w:val="Hipervnculo"/>
+                <w:noProof/>
+              </w:rPr>
+              <w:t>8.</w:t>
+            </w:r>
+            <w:r>
+              <w:rPr>
+                <w:rFonts w:asciiTheme="minorHAnsi" w:eastAsiaTheme="minorEastAsia" w:hAnsiTheme="minorHAnsi" w:cstheme="minorBidi"/>
+                <w:b w:val="0"/>
+                <w:bCs w:val="0"/>
+                <w:caps w:val="0"/>
+                <w:noProof/>
+                <w:kern w:val="2"/>
+                <w:szCs w:val="24"/>
+                <w:lang w:val="es-CL"/>
+                <w14:ligatures w14:val="standardContextual"/>
               </w:rPr>
               <w:tab/>
-              <w:t>6</w:t>
+            </w:r>
+            <w:r>
+              <w:rPr>
+                <w:rStyle w:val="Hipervnculo"/>
+                <w:noProof/>
+              </w:rPr>
+              <w:t>Definición de Roles y responsabilidades</w:t>
+            </w:r>
+            <w:r>
+              <w:rPr>
+                <w:noProof/>
+                <w:webHidden/>
+              </w:rPr>
+              <w:tab/>
+            </w:r>
+            <w:r>
+              <w:rPr>
+                <w:noProof/>
+                <w:webHidden/>
+              </w:rPr>
+              <w:fldChar w:fldCharType="begin"/>
+            </w:r>
+            <w:r>
+              <w:rPr>
+                <w:noProof/>
+                <w:webHidden/>
+              </w:rPr>
+              <w:instrText xml:space="preserve"> PAGEREF _Toc215668029 \h </w:instrText>
+            </w:r>
+            <w:r>
+              <w:rPr>
+                <w:noProof/>
+                <w:webHidden/>
+              </w:rPr>
+            </w:r>
+            <w:r>
+              <w:rPr>
+                <w:noProof/>
+                <w:webHidden/>
+              </w:rPr>
+              <w:fldChar w:fldCharType="separate"/>
+            </w:r>
+            <w:r>
+              <w:rPr>
+                <w:noProof/>
+                <w:webHidden/>
+              </w:rPr>
+              <w:t>5</w:t>
+            </w:r>
+            <w:r>
+              <w:rPr>
+                <w:noProof/>
+                <w:webHidden/>
+              </w:rPr>
+              <w:fldChar w:fldCharType="end"/>
             </w:r>
           </w:hyperlink>
         </w:p>
         <w:p>
           <w:pPr>
-            <w:widowControl w:val="0"/>
+            <w:pStyle w:val="TDC1"/>
             <w:tabs>
-              <w:tab w:val="right" w:leader="dot" w:pos="12000"/>
+              <w:tab w:val="left" w:pos="567"/>
+              <w:tab w:val="right" w:leader="dot" w:pos="9678"/>
             </w:tabs>
-            <w:spacing w:before="60"/>
             <w:rPr>
-              <w:rFonts w:ascii="Arial" w:eastAsia="Arial" w:hAnsi="Arial" w:cs="Arial"/>
-              <w:b/>
-              <w:bCs/>
-              <w:color w:val="000000"/>
+              <w:rFonts w:asciiTheme="minorHAnsi" w:eastAsiaTheme="minorEastAsia" w:hAnsiTheme="minorHAnsi" w:cstheme="minorBidi"/>
+              <w:b w:val="0"/>
+              <w:bCs w:val="0"/>
+              <w:caps w:val="0"/>
+              <w:noProof/>
+              <w:kern w:val="2"/>
+              <w:szCs w:val="24"/>
+              <w:lang w:val="es-CL"/>
+              <w14:ligatures w14:val="standardContextual"/>
             </w:rPr>
           </w:pPr>
-          <w:hyperlink w:anchor="_heading=h.5104am838nal">
-            <w:r>
-              <w:rPr>
-                <w:b/>
-                <w:bCs/>
-                <w:color w:val="000000"/>
-              </w:rPr>
-              <w:t>9. Costos</w:t>
-            </w:r>
-            <w:r>
-              <w:rPr>
-                <w:b/>
-                <w:bCs/>
-                <w:color w:val="000000"/>
+          <w:hyperlink w:anchor="_Toc215668030" w:history="1">
+            <w:r>
+              <w:rPr>
+                <w:rStyle w:val="Hipervnculo"/>
+                <w:noProof/>
+              </w:rPr>
+              <w:t>9.</w:t>
+            </w:r>
+            <w:r>
+              <w:rPr>
+                <w:rFonts w:asciiTheme="minorHAnsi" w:eastAsiaTheme="minorEastAsia" w:hAnsiTheme="minorHAnsi" w:cstheme="minorBidi"/>
+                <w:b w:val="0"/>
+                <w:bCs w:val="0"/>
+                <w:caps w:val="0"/>
+                <w:noProof/>
+                <w:kern w:val="2"/>
+                <w:szCs w:val="24"/>
+                <w:lang w:val="es-CL"/>
+                <w14:ligatures w14:val="standardContextual"/>
               </w:rPr>
               <w:tab/>
-              <w:t>7</w:t>
+            </w:r>
+            <w:r>
+              <w:rPr>
+                <w:rStyle w:val="Hipervnculo"/>
+                <w:noProof/>
+              </w:rPr>
+              <w:t>Costos</w:t>
+            </w:r>
+            <w:r>
+              <w:rPr>
+                <w:noProof/>
+                <w:webHidden/>
+              </w:rPr>
+              <w:tab/>
+            </w:r>
+            <w:r>
+              <w:rPr>
+                <w:noProof/>
+                <w:webHidden/>
+              </w:rPr>
+              <w:fldChar w:fldCharType="begin"/>
+            </w:r>
+            <w:r>
+              <w:rPr>
+                <w:noProof/>
+                <w:webHidden/>
+              </w:rPr>
+              <w:instrText xml:space="preserve"> PAGEREF _Toc215668030 \h </w:instrText>
+            </w:r>
+            <w:r>
+              <w:rPr>
+                <w:noProof/>
+                <w:webHidden/>
+              </w:rPr>
+            </w:r>
+            <w:r>
+              <w:rPr>
+                <w:noProof/>
+                <w:webHidden/>
+              </w:rPr>
+              <w:fldChar w:fldCharType="separate"/>
+            </w:r>
+            <w:r>
+              <w:rPr>
+                <w:noProof/>
+                <w:webHidden/>
+              </w:rPr>
+              <w:t>6</w:t>
+            </w:r>
+            <w:r>
+              <w:rPr>
+                <w:noProof/>
+                <w:webHidden/>
+              </w:rPr>
+              <w:fldChar w:fldCharType="end"/>
             </w:r>
           </w:hyperlink>
         </w:p>
         <w:p>
           <w:pPr>
-            <w:widowControl w:val="0"/>
+            <w:pStyle w:val="TDC1"/>
             <w:tabs>
-              <w:tab w:val="right" w:leader="dot" w:pos="12000"/>
+              <w:tab w:val="left" w:pos="567"/>
+              <w:tab w:val="right" w:leader="dot" w:pos="9678"/>
             </w:tabs>
-            <w:spacing w:before="60"/>
             <w:rPr>
-              <w:rFonts w:ascii="Arial" w:eastAsia="Arial" w:hAnsi="Arial" w:cs="Arial"/>
-              <w:b/>
-              <w:bCs/>
-              <w:color w:val="000000"/>
+              <w:rFonts w:asciiTheme="minorHAnsi" w:eastAsiaTheme="minorEastAsia" w:hAnsiTheme="minorHAnsi" w:cstheme="minorBidi"/>
+              <w:b w:val="0"/>
+              <w:bCs w:val="0"/>
+              <w:caps w:val="0"/>
+              <w:noProof/>
+              <w:kern w:val="2"/>
+              <w:szCs w:val="24"/>
+              <w:lang w:val="es-CL"/>
+              <w14:ligatures w14:val="standardContextual"/>
             </w:rPr>
           </w:pPr>
-          <w:hyperlink w:anchor="_heading=h.ebe2ri4hlvt">
-            <w:r>
-              <w:rPr>
-                <w:rFonts w:ascii="Arial" w:eastAsia="Arial" w:hAnsi="Arial" w:cs="Arial"/>
-                <w:b/>
-                <w:bCs/>
-                <w:color w:val="000000"/>
-              </w:rPr>
-              <w:t>10. Casos de prueba</w:t>
-            </w:r>
-            <w:r>
-              <w:rPr>
-                <w:rFonts w:ascii="Arial" w:eastAsia="Arial" w:hAnsi="Arial" w:cs="Arial"/>
-                <w:b/>
-                <w:bCs/>
-                <w:color w:val="000000"/>
+          <w:hyperlink w:anchor="_Toc215668031" w:history="1">
+            <w:r>
+              <w:rPr>
+                <w:rStyle w:val="Hipervnculo"/>
+                <w:noProof/>
+              </w:rPr>
+              <w:t>10.</w:t>
+            </w:r>
+            <w:r>
+              <w:rPr>
+                <w:rFonts w:asciiTheme="minorHAnsi" w:eastAsiaTheme="minorEastAsia" w:hAnsiTheme="minorHAnsi" w:cstheme="minorBidi"/>
+                <w:b w:val="0"/>
+                <w:bCs w:val="0"/>
+                <w:caps w:val="0"/>
+                <w:noProof/>
+                <w:kern w:val="2"/>
+                <w:szCs w:val="24"/>
+                <w:lang w:val="es-CL"/>
+                <w14:ligatures w14:val="standardContextual"/>
               </w:rPr>
               <w:tab/>
-              <w:t>8</w:t>
+            </w:r>
+            <w:r>
+              <w:rPr>
+                <w:rStyle w:val="Hipervnculo"/>
+                <w:noProof/>
+              </w:rPr>
+              <w:t>Casos de prueba</w:t>
+            </w:r>
+            <w:r>
+              <w:rPr>
+                <w:noProof/>
+                <w:webHidden/>
+              </w:rPr>
+              <w:tab/>
+            </w:r>
+            <w:r>
+              <w:rPr>
+                <w:noProof/>
+                <w:webHidden/>
+              </w:rPr>
+              <w:fldChar w:fldCharType="begin"/>
+            </w:r>
+            <w:r>
+              <w:rPr>
+                <w:noProof/>
+                <w:webHidden/>
+              </w:rPr>
+              <w:instrText xml:space="preserve"> PAGEREF _Toc215668031 \h </w:instrText>
+            </w:r>
+            <w:r>
+              <w:rPr>
+                <w:noProof/>
+                <w:webHidden/>
+              </w:rPr>
+            </w:r>
+            <w:r>
+              <w:rPr>
+                <w:noProof/>
+                <w:webHidden/>
+              </w:rPr>
+              <w:fldChar w:fldCharType="separate"/>
+            </w:r>
+            <w:r>
+              <w:rPr>
+                <w:noProof/>
+                <w:webHidden/>
+              </w:rPr>
+              <w:t>7</w:t>
+            </w:r>
+            <w:r>
+              <w:rPr>
+                <w:noProof/>
+                <w:webHidden/>
+              </w:rPr>
+              <w:fldChar w:fldCharType="end"/>
             </w:r>
           </w:hyperlink>
         </w:p>
         <w:p>
           <w:pPr>
-            <w:widowControl w:val="0"/>
+            <w:pStyle w:val="TDC1"/>
             <w:tabs>
-              <w:tab w:val="right" w:leader="dot" w:pos="12000"/>
+              <w:tab w:val="left" w:pos="567"/>
+              <w:tab w:val="right" w:leader="dot" w:pos="9678"/>
             </w:tabs>
-            <w:spacing w:before="60"/>
             <w:rPr>
-              <w:rFonts w:ascii="Arial" w:eastAsia="Arial" w:hAnsi="Arial" w:cs="Arial"/>
-              <w:b/>
-              <w:bCs/>
-              <w:color w:val="000000"/>
+              <w:rFonts w:asciiTheme="minorHAnsi" w:eastAsiaTheme="minorEastAsia" w:hAnsiTheme="minorHAnsi" w:cstheme="minorBidi"/>
+              <w:b w:val="0"/>
+              <w:bCs w:val="0"/>
+              <w:caps w:val="0"/>
+              <w:noProof/>
+              <w:kern w:val="2"/>
+              <w:szCs w:val="24"/>
+              <w:lang w:val="es-CL"/>
+              <w14:ligatures w14:val="standardContextual"/>
             </w:rPr>
           </w:pPr>
-          <w:hyperlink w:anchor="_heading=h.mp1jhes6wqoy">
-            <w:r>
-              <w:rPr>
-                <w:b/>
-                <w:bCs/>
-                <w:color w:val="000000"/>
-              </w:rPr>
-              <w:t>11. Resumen de riesgos</w:t>
-            </w:r>
-            <w:r>
-              <w:rPr>
-                <w:b/>
-                <w:bCs/>
-                <w:color w:val="000000"/>
+          <w:hyperlink w:anchor="_Toc215668032" w:history="1">
+            <w:r>
+              <w:rPr>
+                <w:rStyle w:val="Hipervnculo"/>
+                <w:noProof/>
+              </w:rPr>
+              <w:t>11.</w:t>
+            </w:r>
+            <w:r>
+              <w:rPr>
+                <w:rFonts w:asciiTheme="minorHAnsi" w:eastAsiaTheme="minorEastAsia" w:hAnsiTheme="minorHAnsi" w:cstheme="minorBidi"/>
+                <w:b w:val="0"/>
+                <w:bCs w:val="0"/>
+                <w:caps w:val="0"/>
+                <w:noProof/>
+                <w:kern w:val="2"/>
+                <w:szCs w:val="24"/>
+                <w:lang w:val="es-CL"/>
+                <w14:ligatures w14:val="standardContextual"/>
               </w:rPr>
               <w:tab/>
-              <w:t>9</w:t>
+            </w:r>
+            <w:r>
+              <w:rPr>
+                <w:rStyle w:val="Hipervnculo"/>
+                <w:noProof/>
+              </w:rPr>
+              <w:t>Resumen de riesgos</w:t>
+            </w:r>
+            <w:r>
+              <w:rPr>
+                <w:noProof/>
+                <w:webHidden/>
+              </w:rPr>
+              <w:tab/>
+            </w:r>
+            <w:r>
+              <w:rPr>
+                <w:noProof/>
+                <w:webHidden/>
+              </w:rPr>
+              <w:fldChar w:fldCharType="begin"/>
+            </w:r>
+            <w:r>
+              <w:rPr>
+                <w:noProof/>
+                <w:webHidden/>
+              </w:rPr>
+              <w:instrText xml:space="preserve"> PAGEREF _Toc215668032 \h </w:instrText>
+            </w:r>
+            <w:r>
+              <w:rPr>
+                <w:noProof/>
+                <w:webHidden/>
+              </w:rPr>
+            </w:r>
+            <w:r>
+              <w:rPr>
+                <w:noProof/>
+                <w:webHidden/>
+              </w:rPr>
+              <w:fldChar w:fldCharType="separate"/>
+            </w:r>
+            <w:r>
+              <w:rPr>
+                <w:noProof/>
+                <w:webHidden/>
+              </w:rPr>
+              <w:t>8</w:t>
+            </w:r>
+            <w:r>
+              <w:rPr>
+                <w:noProof/>
+                <w:webHidden/>
+              </w:rPr>
+              <w:fldChar w:fldCharType="end"/>
             </w:r>
           </w:hyperlink>
         </w:p>
         <w:p>
           <w:pPr>
-            <w:widowControl w:val="0"/>
+            <w:pStyle w:val="TDC1"/>
             <w:tabs>
-              <w:tab w:val="right" w:leader="dot" w:pos="12000"/>
+              <w:tab w:val="left" w:pos="567"/>
+              <w:tab w:val="right" w:leader="dot" w:pos="9678"/>
             </w:tabs>
-            <w:spacing w:before="60"/>
             <w:rPr>
-              <w:rFonts w:ascii="Arial" w:eastAsia="Arial" w:hAnsi="Arial" w:cs="Arial"/>
-              <w:b/>
-              <w:bCs/>
-              <w:color w:val="000000"/>
+              <w:rFonts w:asciiTheme="minorHAnsi" w:eastAsiaTheme="minorEastAsia" w:hAnsiTheme="minorHAnsi" w:cstheme="minorBidi"/>
+              <w:b w:val="0"/>
+              <w:bCs w:val="0"/>
+              <w:caps w:val="0"/>
+              <w:noProof/>
+              <w:kern w:val="2"/>
+              <w:szCs w:val="24"/>
+              <w:lang w:val="es-CL"/>
+              <w14:ligatures w14:val="standardContextual"/>
             </w:rPr>
           </w:pPr>
-          <w:hyperlink w:anchor="_heading=h.iczy5v4ygug0">
-            <w:r>
-              <w:rPr>
-                <w:b/>
-                <w:bCs/>
-                <w:color w:val="000000"/>
-              </w:rPr>
-              <w:t>12. Épicas para el proyecto</w:t>
-            </w:r>
-            <w:r>
-              <w:rPr>
-                <w:b/>
-                <w:bCs/>
-                <w:color w:val="000000"/>
+          <w:hyperlink w:anchor="_Toc215668033" w:history="1">
+            <w:r>
+              <w:rPr>
+                <w:rStyle w:val="Hipervnculo"/>
+                <w:noProof/>
+              </w:rPr>
+              <w:t>12.</w:t>
+            </w:r>
+            <w:r>
+              <w:rPr>
+                <w:rFonts w:asciiTheme="minorHAnsi" w:eastAsiaTheme="minorEastAsia" w:hAnsiTheme="minorHAnsi" w:cstheme="minorBidi"/>
+                <w:b w:val="0"/>
+                <w:bCs w:val="0"/>
+                <w:caps w:val="0"/>
+                <w:noProof/>
+                <w:kern w:val="2"/>
+                <w:szCs w:val="24"/>
+                <w:lang w:val="es-CL"/>
+                <w14:ligatures w14:val="standardContextual"/>
               </w:rPr>
               <w:tab/>
+            </w:r>
+            <w:r>
+              <w:rPr>
+                <w:rStyle w:val="Hipervnculo"/>
+                <w:noProof/>
+              </w:rPr>
+              <w:t>Épicas para el proyecto</w:t>
+            </w:r>
+            <w:r>
+              <w:rPr>
+                <w:noProof/>
+                <w:webHidden/>
+              </w:rPr>
+              <w:tab/>
+            </w:r>
+            <w:r>
+              <w:rPr>
+                <w:noProof/>
+                <w:webHidden/>
+              </w:rPr>
+              <w:fldChar w:fldCharType="begin"/>
+            </w:r>
+            <w:r>
+              <w:rPr>
+                <w:noProof/>
+                <w:webHidden/>
+              </w:rPr>
+              <w:instrText xml:space="preserve"> PAGEREF _Toc215668033 \h </w:instrText>
+            </w:r>
+            <w:r>
+              <w:rPr>
+                <w:noProof/>
+                <w:webHidden/>
+              </w:rPr>
+            </w:r>
+            <w:r>
+              <w:rPr>
+                <w:noProof/>
+                <w:webHidden/>
+              </w:rPr>
+              <w:fldChar w:fldCharType="separate"/>
+            </w:r>
+            <w:r>
+              <w:rPr>
+                <w:noProof/>
+                <w:webHidden/>
+              </w:rPr>
               <w:t>10</w:t>
+            </w:r>
+            <w:r>
+              <w:rPr>
+                <w:noProof/>
+                <w:webHidden/>
+              </w:rPr>
+              <w:fldChar w:fldCharType="end"/>
             </w:r>
           </w:hyperlink>
         </w:p>
         <w:p>
           <w:pPr>
-            <w:widowControl w:val="0"/>
+            <w:pStyle w:val="TDC1"/>
             <w:tabs>
-              <w:tab w:val="right" w:leader="dot" w:pos="12000"/>
+              <w:tab w:val="left" w:pos="567"/>
+              <w:tab w:val="right" w:leader="dot" w:pos="9678"/>
             </w:tabs>
-            <w:spacing w:before="60"/>
             <w:rPr>
-              <w:rFonts w:ascii="Arial" w:eastAsia="Arial" w:hAnsi="Arial" w:cs="Arial"/>
-              <w:b/>
-              <w:bCs/>
-              <w:color w:val="000000"/>
+              <w:rFonts w:asciiTheme="minorHAnsi" w:eastAsiaTheme="minorEastAsia" w:hAnsiTheme="minorHAnsi" w:cstheme="minorBidi"/>
+              <w:b w:val="0"/>
+              <w:bCs w:val="0"/>
+              <w:caps w:val="0"/>
+              <w:noProof/>
+              <w:kern w:val="2"/>
+              <w:szCs w:val="24"/>
+              <w:lang w:val="es-CL"/>
+              <w14:ligatures w14:val="standardContextual"/>
             </w:rPr>
           </w:pPr>
-          <w:hyperlink w:anchor="_heading=h.kbte225gbh0l">
-            <w:r>
-              <w:rPr>
-                <w:b/>
-                <w:bCs/>
-                <w:color w:val="000000"/>
-              </w:rPr>
-              <w:t>13. Priorización de Épicas</w:t>
-            </w:r>
-            <w:r>
-              <w:rPr>
-                <w:b/>
-                <w:bCs/>
-                <w:color w:val="000000"/>
+          <w:hyperlink w:anchor="_Toc215668034" w:history="1">
+            <w:r>
+              <w:rPr>
+                <w:rStyle w:val="Hipervnculo"/>
+                <w:noProof/>
+              </w:rPr>
+              <w:t>13.</w:t>
+            </w:r>
+            <w:r>
+              <w:rPr>
+                <w:rFonts w:asciiTheme="minorHAnsi" w:eastAsiaTheme="minorEastAsia" w:hAnsiTheme="minorHAnsi" w:cstheme="minorBidi"/>
+                <w:b w:val="0"/>
+                <w:bCs w:val="0"/>
+                <w:caps w:val="0"/>
+                <w:noProof/>
+                <w:kern w:val="2"/>
+                <w:szCs w:val="24"/>
+                <w:lang w:val="es-CL"/>
+                <w14:ligatures w14:val="standardContextual"/>
               </w:rPr>
               <w:tab/>
-              <w:t>11</w:t>
+            </w:r>
+            <w:r>
+              <w:rPr>
+                <w:rStyle w:val="Hipervnculo"/>
+                <w:noProof/>
+              </w:rPr>
+              <w:t>Priorización de Épicas</w:t>
+            </w:r>
+            <w:r>
+              <w:rPr>
+                <w:noProof/>
+                <w:webHidden/>
+              </w:rPr>
+              <w:tab/>
+            </w:r>
+            <w:r>
+              <w:rPr>
+                <w:noProof/>
+                <w:webHidden/>
+              </w:rPr>
+              <w:fldChar w:fldCharType="begin"/>
+            </w:r>
+            <w:r>
+              <w:rPr>
+                <w:noProof/>
+                <w:webHidden/>
+              </w:rPr>
+              <w:instrText xml:space="preserve"> PAGEREF _Toc215668034 \h </w:instrText>
+            </w:r>
+            <w:r>
+              <w:rPr>
+                <w:noProof/>
+                <w:webHidden/>
+              </w:rPr>
+            </w:r>
+            <w:r>
+              <w:rPr>
+                <w:noProof/>
+                <w:webHidden/>
+              </w:rPr>
+              <w:fldChar w:fldCharType="separate"/>
+            </w:r>
+            <w:r>
+              <w:rPr>
+                <w:noProof/>
+                <w:webHidden/>
+              </w:rPr>
+              <w:t>10</w:t>
+            </w:r>
+            <w:r>
+              <w:rPr>
+                <w:noProof/>
+                <w:webHidden/>
+              </w:rPr>
+              <w:fldChar w:fldCharType="end"/>
             </w:r>
           </w:hyperlink>
         </w:p>
         <w:p>
           <w:pPr>
-            <w:widowControl w:val="0"/>
+            <w:pStyle w:val="TDC1"/>
             <w:tabs>
-              <w:tab w:val="right" w:leader="dot" w:pos="12000"/>
+              <w:tab w:val="left" w:pos="567"/>
+              <w:tab w:val="right" w:leader="dot" w:pos="9678"/>
             </w:tabs>
-            <w:spacing w:before="60"/>
             <w:rPr>
-              <w:rFonts w:ascii="Arial" w:eastAsia="Arial" w:hAnsi="Arial" w:cs="Arial"/>
-              <w:b/>
-              <w:bCs/>
-              <w:color w:val="000000"/>
+              <w:rFonts w:asciiTheme="minorHAnsi" w:eastAsiaTheme="minorEastAsia" w:hAnsiTheme="minorHAnsi" w:cstheme="minorBidi"/>
+              <w:b w:val="0"/>
+              <w:bCs w:val="0"/>
+              <w:caps w:val="0"/>
+              <w:noProof/>
+              <w:kern w:val="2"/>
+              <w:szCs w:val="24"/>
+              <w:lang w:val="es-CL"/>
+              <w14:ligatures w14:val="standardContextual"/>
             </w:rPr>
           </w:pPr>
-          <w:hyperlink w:anchor="_heading=h.cxzc1j9jhqh9">
-            <w:r>
-              <w:rPr>
-                <w:b/>
-                <w:bCs/>
-                <w:color w:val="000000"/>
-              </w:rPr>
-              <w:t>14. Definición de Historias de Usuario</w:t>
-            </w:r>
-            <w:r>
-              <w:rPr>
-                <w:b/>
-                <w:bCs/>
-                <w:color w:val="000000"/>
+          <w:hyperlink w:anchor="_Toc215668035" w:history="1">
+            <w:r>
+              <w:rPr>
+                <w:rStyle w:val="Hipervnculo"/>
+                <w:noProof/>
+              </w:rPr>
+              <w:t>14.</w:t>
+            </w:r>
+            <w:r>
+              <w:rPr>
+                <w:rFonts w:asciiTheme="minorHAnsi" w:eastAsiaTheme="minorEastAsia" w:hAnsiTheme="minorHAnsi" w:cstheme="minorBidi"/>
+                <w:b w:val="0"/>
+                <w:bCs w:val="0"/>
+                <w:caps w:val="0"/>
+                <w:noProof/>
+                <w:kern w:val="2"/>
+                <w:szCs w:val="24"/>
+                <w:lang w:val="es-CL"/>
+                <w14:ligatures w14:val="standardContextual"/>
               </w:rPr>
               <w:tab/>
-              <w:t>12</w:t>
+            </w:r>
+            <w:r>
+              <w:rPr>
+                <w:rStyle w:val="Hipervnculo"/>
+                <w:noProof/>
+              </w:rPr>
+              <w:t>Definición de Historias de Usuario</w:t>
+            </w:r>
+            <w:r>
+              <w:rPr>
+                <w:noProof/>
+                <w:webHidden/>
+              </w:rPr>
+              <w:tab/>
+            </w:r>
+            <w:r>
+              <w:rPr>
+                <w:noProof/>
+                <w:webHidden/>
+              </w:rPr>
+              <w:fldChar w:fldCharType="begin"/>
+            </w:r>
+            <w:r>
+              <w:rPr>
+                <w:noProof/>
+                <w:webHidden/>
+              </w:rPr>
+              <w:instrText xml:space="preserve"> PAGEREF _Toc215668035 \h </w:instrText>
+            </w:r>
+            <w:r>
+              <w:rPr>
+                <w:noProof/>
+                <w:webHidden/>
+              </w:rPr>
+            </w:r>
+            <w:r>
+              <w:rPr>
+                <w:noProof/>
+                <w:webHidden/>
+              </w:rPr>
+              <w:fldChar w:fldCharType="separate"/>
+            </w:r>
+            <w:r>
+              <w:rPr>
+                <w:noProof/>
+                <w:webHidden/>
+              </w:rPr>
+              <w:t>11</w:t>
+            </w:r>
+            <w:r>
+              <w:rPr>
+                <w:noProof/>
+                <w:webHidden/>
+              </w:rPr>
+              <w:fldChar w:fldCharType="end"/>
             </w:r>
           </w:hyperlink>
         </w:p>
         <w:p>
           <w:pPr>
-            <w:widowControl w:val="0"/>
+            <w:pStyle w:val="TDC1"/>
             <w:tabs>
-              <w:tab w:val="right" w:leader="dot" w:pos="12000"/>
+              <w:tab w:val="left" w:pos="567"/>
+              <w:tab w:val="right" w:leader="dot" w:pos="9678"/>
             </w:tabs>
-            <w:spacing w:before="60"/>
             <w:rPr>
-              <w:rFonts w:ascii="Arial" w:eastAsia="Arial" w:hAnsi="Arial" w:cs="Arial"/>
-              <w:b/>
-              <w:bCs/>
-              <w:color w:val="000000"/>
+              <w:rFonts w:asciiTheme="minorHAnsi" w:eastAsiaTheme="minorEastAsia" w:hAnsiTheme="minorHAnsi" w:cstheme="minorBidi"/>
+              <w:b w:val="0"/>
+              <w:bCs w:val="0"/>
+              <w:caps w:val="0"/>
+              <w:noProof/>
+              <w:kern w:val="2"/>
+              <w:szCs w:val="24"/>
+              <w:lang w:val="es-CL"/>
+              <w14:ligatures w14:val="standardContextual"/>
             </w:rPr>
           </w:pPr>
-          <w:hyperlink w:anchor="_heading=h.wtbo2yylrfa9">
-            <w:r>
-              <w:rPr>
-                <w:b/>
-                <w:bCs/>
-                <w:color w:val="000000"/>
-              </w:rPr>
-              <w:t>15. Product Backlog del Proyecto</w:t>
-            </w:r>
-            <w:r>
-              <w:rPr>
-                <w:b/>
-                <w:bCs/>
-                <w:color w:val="000000"/>
+          <w:hyperlink w:anchor="_Toc215668036" w:history="1">
+            <w:r>
+              <w:rPr>
+                <w:rStyle w:val="Hipervnculo"/>
+                <w:noProof/>
+              </w:rPr>
+              <w:t>15.</w:t>
+            </w:r>
+            <w:r>
+              <w:rPr>
+                <w:rFonts w:asciiTheme="minorHAnsi" w:eastAsiaTheme="minorEastAsia" w:hAnsiTheme="minorHAnsi" w:cstheme="minorBidi"/>
+                <w:b w:val="0"/>
+                <w:bCs w:val="0"/>
+                <w:caps w:val="0"/>
+                <w:noProof/>
+                <w:kern w:val="2"/>
+                <w:szCs w:val="24"/>
+                <w:lang w:val="es-CL"/>
+                <w14:ligatures w14:val="standardContextual"/>
               </w:rPr>
               <w:tab/>
-              <w:t>13</w:t>
+            </w:r>
+            <w:r>
+              <w:rPr>
+                <w:rStyle w:val="Hipervnculo"/>
+                <w:noProof/>
+              </w:rPr>
+              <w:t>Product Backlog del Proyecto</w:t>
+            </w:r>
+            <w:r>
+              <w:rPr>
+                <w:noProof/>
+                <w:webHidden/>
+              </w:rPr>
+              <w:tab/>
+            </w:r>
+            <w:r>
+              <w:rPr>
+                <w:noProof/>
+                <w:webHidden/>
+              </w:rPr>
+              <w:fldChar w:fldCharType="begin"/>
+            </w:r>
+            <w:r>
+              <w:rPr>
+                <w:noProof/>
+                <w:webHidden/>
+              </w:rPr>
+              <w:instrText xml:space="preserve"> PAGEREF _Toc215668036 \h </w:instrText>
+            </w:r>
+            <w:r>
+              <w:rPr>
+                <w:noProof/>
+                <w:webHidden/>
+              </w:rPr>
+            </w:r>
+            <w:r>
+              <w:rPr>
+                <w:noProof/>
+                <w:webHidden/>
+              </w:rPr>
+              <w:fldChar w:fldCharType="separate"/>
+            </w:r>
+            <w:r>
+              <w:rPr>
+                <w:noProof/>
+                <w:webHidden/>
+              </w:rPr>
+              <w:t>12</w:t>
+            </w:r>
+            <w:r>
+              <w:rPr>
+                <w:noProof/>
+                <w:webHidden/>
+              </w:rPr>
+              <w:fldChar w:fldCharType="end"/>
             </w:r>
           </w:hyperlink>
         </w:p>
         <w:p>
           <w:pPr>
-            <w:widowControl w:val="0"/>
+            <w:pStyle w:val="TDC1"/>
             <w:tabs>
-              <w:tab w:val="right" w:leader="dot" w:pos="12000"/>
+              <w:tab w:val="left" w:pos="567"/>
+              <w:tab w:val="right" w:leader="dot" w:pos="9678"/>
             </w:tabs>
-            <w:spacing w:before="60"/>
             <w:rPr>
-              <w:rFonts w:ascii="Arial" w:eastAsia="Arial" w:hAnsi="Arial" w:cs="Arial"/>
-              <w:b/>
-              <w:bCs/>
-              <w:color w:val="000000"/>
+              <w:rFonts w:asciiTheme="minorHAnsi" w:eastAsiaTheme="minorEastAsia" w:hAnsiTheme="minorHAnsi" w:cstheme="minorBidi"/>
+              <w:b w:val="0"/>
+              <w:bCs w:val="0"/>
+              <w:caps w:val="0"/>
+              <w:noProof/>
+              <w:kern w:val="2"/>
+              <w:szCs w:val="24"/>
+              <w:lang w:val="es-CL"/>
+              <w14:ligatures w14:val="standardContextual"/>
             </w:rPr>
           </w:pPr>
-          <w:hyperlink w:anchor="_heading=h.ihj64vcnk0i">
-            <w:r>
-              <w:rPr>
-                <w:b/>
-                <w:bCs/>
-                <w:color w:val="000000"/>
-              </w:rPr>
-              <w:t>16. Estimación de puntos de historia.</w:t>
-            </w:r>
-            <w:r>
-              <w:rPr>
-                <w:b/>
-                <w:bCs/>
-                <w:color w:val="000000"/>
+          <w:hyperlink w:anchor="_Toc215668037" w:history="1">
+            <w:r>
+              <w:rPr>
+                <w:rStyle w:val="Hipervnculo"/>
+                <w:noProof/>
+              </w:rPr>
+              <w:t>16.</w:t>
+            </w:r>
+            <w:r>
+              <w:rPr>
+                <w:rFonts w:asciiTheme="minorHAnsi" w:eastAsiaTheme="minorEastAsia" w:hAnsiTheme="minorHAnsi" w:cstheme="minorBidi"/>
+                <w:b w:val="0"/>
+                <w:bCs w:val="0"/>
+                <w:caps w:val="0"/>
+                <w:noProof/>
+                <w:kern w:val="2"/>
+                <w:szCs w:val="24"/>
+                <w:lang w:val="es-CL"/>
+                <w14:ligatures w14:val="standardContextual"/>
               </w:rPr>
               <w:tab/>
-              <w:t>15</w:t>
+            </w:r>
+            <w:r>
+              <w:rPr>
+                <w:rStyle w:val="Hipervnculo"/>
+                <w:noProof/>
+              </w:rPr>
+              <w:t>Estimación de puntos de historia.</w:t>
+            </w:r>
+            <w:r>
+              <w:rPr>
+                <w:noProof/>
+                <w:webHidden/>
+              </w:rPr>
+              <w:tab/>
+            </w:r>
+            <w:r>
+              <w:rPr>
+                <w:noProof/>
+                <w:webHidden/>
+              </w:rPr>
+              <w:fldChar w:fldCharType="begin"/>
+            </w:r>
+            <w:r>
+              <w:rPr>
+                <w:noProof/>
+                <w:webHidden/>
+              </w:rPr>
+              <w:instrText xml:space="preserve"> PAGEREF _Toc215668037 \h </w:instrText>
+            </w:r>
+            <w:r>
+              <w:rPr>
+                <w:noProof/>
+                <w:webHidden/>
+              </w:rPr>
+            </w:r>
+            <w:r>
+              <w:rPr>
+                <w:noProof/>
+                <w:webHidden/>
+              </w:rPr>
+              <w:fldChar w:fldCharType="separate"/>
+            </w:r>
+            <w:r>
+              <w:rPr>
+                <w:noProof/>
+                <w:webHidden/>
+              </w:rPr>
+              <w:t>14</w:t>
+            </w:r>
+            <w:r>
+              <w:rPr>
+                <w:noProof/>
+                <w:webHidden/>
+              </w:rPr>
+              <w:fldChar w:fldCharType="end"/>
             </w:r>
           </w:hyperlink>
         </w:p>
         <w:p>
           <w:pPr>
-            <w:widowControl w:val="0"/>
+            <w:pStyle w:val="TDC1"/>
             <w:tabs>
-              <w:tab w:val="right" w:leader="dot" w:pos="12000"/>
+              <w:tab w:val="left" w:pos="567"/>
+              <w:tab w:val="right" w:leader="dot" w:pos="9678"/>
             </w:tabs>
-            <w:spacing w:before="60"/>
             <w:rPr>
-              <w:rFonts w:ascii="Arial" w:eastAsia="Arial" w:hAnsi="Arial" w:cs="Arial"/>
-              <w:b/>
-              <w:bCs/>
-              <w:color w:val="000000"/>
+              <w:rFonts w:asciiTheme="minorHAnsi" w:eastAsiaTheme="minorEastAsia" w:hAnsiTheme="minorHAnsi" w:cstheme="minorBidi"/>
+              <w:b w:val="0"/>
+              <w:bCs w:val="0"/>
+              <w:caps w:val="0"/>
+              <w:noProof/>
+              <w:kern w:val="2"/>
+              <w:szCs w:val="24"/>
+              <w:lang w:val="es-CL"/>
+              <w14:ligatures w14:val="standardContextual"/>
             </w:rPr>
           </w:pPr>
-          <w:hyperlink w:anchor="_heading=h.2sdjgsfmrkll">
-            <w:r>
-              <w:rPr>
-                <w:b/>
-                <w:bCs/>
-                <w:color w:val="000000"/>
-              </w:rPr>
-              <w:t>17. Técnica de estimación</w:t>
-            </w:r>
-            <w:r>
-              <w:rPr>
-                <w:b/>
-                <w:bCs/>
-                <w:color w:val="000000"/>
+          <w:hyperlink w:anchor="_Toc215668038" w:history="1">
+            <w:r>
+              <w:rPr>
+                <w:rStyle w:val="Hipervnculo"/>
+                <w:noProof/>
+              </w:rPr>
+              <w:t>17.</w:t>
+            </w:r>
+            <w:r>
+              <w:rPr>
+                <w:rFonts w:asciiTheme="minorHAnsi" w:eastAsiaTheme="minorEastAsia" w:hAnsiTheme="minorHAnsi" w:cstheme="minorBidi"/>
+                <w:b w:val="0"/>
+                <w:bCs w:val="0"/>
+                <w:caps w:val="0"/>
+                <w:noProof/>
+                <w:kern w:val="2"/>
+                <w:szCs w:val="24"/>
+                <w:lang w:val="es-CL"/>
+                <w14:ligatures w14:val="standardContextual"/>
               </w:rPr>
               <w:tab/>
-              <w:t>16</w:t>
+            </w:r>
+            <w:r>
+              <w:rPr>
+                <w:rStyle w:val="Hipervnculo"/>
+                <w:noProof/>
+              </w:rPr>
+              <w:t>Técnica de estimación</w:t>
+            </w:r>
+            <w:r>
+              <w:rPr>
+                <w:noProof/>
+                <w:webHidden/>
+              </w:rPr>
+              <w:tab/>
+            </w:r>
+            <w:r>
+              <w:rPr>
+                <w:noProof/>
+                <w:webHidden/>
+              </w:rPr>
+              <w:fldChar w:fldCharType="begin"/>
+            </w:r>
+            <w:r>
+              <w:rPr>
+                <w:noProof/>
+                <w:webHidden/>
+              </w:rPr>
+              <w:instrText xml:space="preserve"> PAGEREF _Toc215668038 \h </w:instrText>
+            </w:r>
+            <w:r>
+              <w:rPr>
+                <w:noProof/>
+                <w:webHidden/>
+              </w:rPr>
+            </w:r>
+            <w:r>
+              <w:rPr>
+                <w:noProof/>
+                <w:webHidden/>
+              </w:rPr>
+              <w:fldChar w:fldCharType="separate"/>
+            </w:r>
+            <w:r>
+              <w:rPr>
+                <w:noProof/>
+                <w:webHidden/>
+              </w:rPr>
+              <w:t>15</w:t>
+            </w:r>
+            <w:r>
+              <w:rPr>
+                <w:noProof/>
+                <w:webHidden/>
+              </w:rPr>
+              <w:fldChar w:fldCharType="end"/>
             </w:r>
           </w:hyperlink>
         </w:p>
         <w:p>
           <w:pPr>
-            <w:widowControl w:val="0"/>
+            <w:pStyle w:val="TDC1"/>
             <w:tabs>
-              <w:tab w:val="right" w:leader="dot" w:pos="12000"/>
+              <w:tab w:val="left" w:pos="567"/>
+              <w:tab w:val="right" w:leader="dot" w:pos="9678"/>
             </w:tabs>
-            <w:spacing w:before="60"/>
             <w:rPr>
-              <w:rFonts w:ascii="Arial" w:eastAsia="Arial" w:hAnsi="Arial" w:cs="Arial"/>
-              <w:b/>
-              <w:bCs/>
-              <w:color w:val="000000"/>
+              <w:rFonts w:asciiTheme="minorHAnsi" w:eastAsiaTheme="minorEastAsia" w:hAnsiTheme="minorHAnsi" w:cstheme="minorBidi"/>
+              <w:b w:val="0"/>
+              <w:bCs w:val="0"/>
+              <w:caps w:val="0"/>
+              <w:noProof/>
+              <w:kern w:val="2"/>
+              <w:szCs w:val="24"/>
+              <w:lang w:val="es-CL"/>
+              <w14:ligatures w14:val="standardContextual"/>
             </w:rPr>
           </w:pPr>
-          <w:hyperlink w:anchor="_heading=h.mvk0prn506cg">
-            <w:r>
-              <w:rPr>
-                <w:b/>
-                <w:bCs/>
-                <w:color w:val="000000"/>
-              </w:rPr>
-              <w:t>18. Sprint Planning</w:t>
-            </w:r>
-            <w:r>
-              <w:rPr>
-                <w:b/>
-                <w:bCs/>
-                <w:color w:val="000000"/>
+          <w:hyperlink w:anchor="_Toc215668039" w:history="1">
+            <w:r>
+              <w:rPr>
+                <w:rStyle w:val="Hipervnculo"/>
+                <w:noProof/>
+              </w:rPr>
+              <w:t>18.</w:t>
+            </w:r>
+            <w:r>
+              <w:rPr>
+                <w:rFonts w:asciiTheme="minorHAnsi" w:eastAsiaTheme="minorEastAsia" w:hAnsiTheme="minorHAnsi" w:cstheme="minorBidi"/>
+                <w:b w:val="0"/>
+                <w:bCs w:val="0"/>
+                <w:caps w:val="0"/>
+                <w:noProof/>
+                <w:kern w:val="2"/>
+                <w:szCs w:val="24"/>
+                <w:lang w:val="es-CL"/>
+                <w14:ligatures w14:val="standardContextual"/>
               </w:rPr>
               <w:tab/>
-              <w:t>17</w:t>
+            </w:r>
+            <w:r>
+              <w:rPr>
+                <w:rStyle w:val="Hipervnculo"/>
+                <w:noProof/>
+              </w:rPr>
+              <w:t>Sprint Planning</w:t>
+            </w:r>
+            <w:r>
+              <w:rPr>
+                <w:noProof/>
+                <w:webHidden/>
+              </w:rPr>
+              <w:tab/>
+            </w:r>
+            <w:r>
+              <w:rPr>
+                <w:noProof/>
+                <w:webHidden/>
+              </w:rPr>
+              <w:fldChar w:fldCharType="begin"/>
+            </w:r>
+            <w:r>
+              <w:rPr>
+                <w:noProof/>
+                <w:webHidden/>
+              </w:rPr>
+              <w:instrText xml:space="preserve"> PAGEREF _Toc215668039 \h </w:instrText>
+            </w:r>
+            <w:r>
+              <w:rPr>
+                <w:noProof/>
+                <w:webHidden/>
+              </w:rPr>
+            </w:r>
+            <w:r>
+              <w:rPr>
+                <w:noProof/>
+                <w:webHidden/>
+              </w:rPr>
+              <w:fldChar w:fldCharType="separate"/>
+            </w:r>
+            <w:r>
+              <w:rPr>
+                <w:noProof/>
+                <w:webHidden/>
+              </w:rPr>
+              <w:t>16</w:t>
+            </w:r>
+            <w:r>
+              <w:rPr>
+                <w:noProof/>
+                <w:webHidden/>
+              </w:rPr>
+              <w:fldChar w:fldCharType="end"/>
             </w:r>
           </w:hyperlink>
         </w:p>
         <w:p>
           <w:pPr>
-            <w:widowControl w:val="0"/>
+            <w:pStyle w:val="TDC1"/>
             <w:tabs>
-              <w:tab w:val="right" w:leader="dot" w:pos="12000"/>
+              <w:tab w:val="left" w:pos="567"/>
+              <w:tab w:val="right" w:leader="dot" w:pos="9678"/>
             </w:tabs>
-            <w:spacing w:before="60"/>
             <w:rPr>
-              <w:rFonts w:ascii="Arial" w:eastAsia="Arial" w:hAnsi="Arial" w:cs="Arial"/>
-              <w:b/>
-              <w:bCs/>
-              <w:color w:val="000000"/>
+              <w:rFonts w:asciiTheme="minorHAnsi" w:eastAsiaTheme="minorEastAsia" w:hAnsiTheme="minorHAnsi" w:cstheme="minorBidi"/>
+              <w:b w:val="0"/>
+              <w:bCs w:val="0"/>
+              <w:caps w:val="0"/>
+              <w:noProof/>
+              <w:kern w:val="2"/>
+              <w:szCs w:val="24"/>
+              <w:lang w:val="es-CL"/>
+              <w14:ligatures w14:val="standardContextual"/>
             </w:rPr>
           </w:pPr>
-          <w:hyperlink w:anchor="_heading=h.afm4oez6dx52">
-            <w:r>
-              <w:rPr>
-                <w:rFonts w:ascii="Arial" w:eastAsia="Arial" w:hAnsi="Arial" w:cs="Arial"/>
-                <w:b/>
-                <w:bCs/>
-                <w:color w:val="000000"/>
-              </w:rPr>
-              <w:t>19. Definición y estimación de tareas</w:t>
-            </w:r>
-            <w:r>
-              <w:rPr>
-                <w:rFonts w:ascii="Arial" w:eastAsia="Arial" w:hAnsi="Arial" w:cs="Arial"/>
-                <w:b/>
-                <w:bCs/>
-                <w:color w:val="000000"/>
+          <w:hyperlink w:anchor="_Toc215668040" w:history="1">
+            <w:r>
+              <w:rPr>
+                <w:rStyle w:val="Hipervnculo"/>
+                <w:noProof/>
+              </w:rPr>
+              <w:t>19.</w:t>
+            </w:r>
+            <w:r>
+              <w:rPr>
+                <w:rFonts w:asciiTheme="minorHAnsi" w:eastAsiaTheme="minorEastAsia" w:hAnsiTheme="minorHAnsi" w:cstheme="minorBidi"/>
+                <w:b w:val="0"/>
+                <w:bCs w:val="0"/>
+                <w:caps w:val="0"/>
+                <w:noProof/>
+                <w:kern w:val="2"/>
+                <w:szCs w:val="24"/>
+                <w:lang w:val="es-CL"/>
+                <w14:ligatures w14:val="standardContextual"/>
               </w:rPr>
               <w:tab/>
-              <w:t>17</w:t>
+            </w:r>
+            <w:r>
+              <w:rPr>
+                <w:rStyle w:val="Hipervnculo"/>
+                <w:noProof/>
+              </w:rPr>
+              <w:t>Definición y estimación de tareas</w:t>
+            </w:r>
+            <w:r>
+              <w:rPr>
+                <w:noProof/>
+                <w:webHidden/>
+              </w:rPr>
+              <w:tab/>
+            </w:r>
+            <w:r>
+              <w:rPr>
+                <w:noProof/>
+                <w:webHidden/>
+              </w:rPr>
+              <w:fldChar w:fldCharType="begin"/>
+            </w:r>
+            <w:r>
+              <w:rPr>
+                <w:noProof/>
+                <w:webHidden/>
+              </w:rPr>
+              <w:instrText xml:space="preserve"> PAGEREF _Toc215668040 \h </w:instrText>
+            </w:r>
+            <w:r>
+              <w:rPr>
+                <w:noProof/>
+                <w:webHidden/>
+              </w:rPr>
+            </w:r>
+            <w:r>
+              <w:rPr>
+                <w:noProof/>
+                <w:webHidden/>
+              </w:rPr>
+              <w:fldChar w:fldCharType="separate"/>
+            </w:r>
+            <w:r>
+              <w:rPr>
+                <w:noProof/>
+                <w:webHidden/>
+              </w:rPr>
+              <w:t>16</w:t>
+            </w:r>
+            <w:r>
+              <w:rPr>
+                <w:noProof/>
+                <w:webHidden/>
+              </w:rPr>
+              <w:fldChar w:fldCharType="end"/>
             </w:r>
           </w:hyperlink>
         </w:p>
         <w:p>
           <w:pPr>
-            <w:widowControl w:val="0"/>
+            <w:pStyle w:val="TDC2"/>
             <w:tabs>
-              <w:tab w:val="right" w:leader="dot" w:pos="12000"/>
+              <w:tab w:val="left" w:pos="1100"/>
+              <w:tab w:val="right" w:leader="dot" w:pos="9678"/>
             </w:tabs>
-            <w:spacing w:before="60"/>
-            <w:ind w:left="360"/>
             <w:rPr>
-              <w:rFonts w:ascii="Arial" w:eastAsia="Arial" w:hAnsi="Arial" w:cs="Arial"/>
-              <w:color w:val="000000"/>
+              <w:rFonts w:asciiTheme="minorHAnsi" w:eastAsiaTheme="minorEastAsia" w:hAnsiTheme="minorHAnsi" w:cstheme="minorBidi"/>
+              <w:b w:val="0"/>
+              <w:smallCaps w:val="0"/>
+              <w:noProof/>
+              <w:kern w:val="2"/>
+              <w:szCs w:val="24"/>
+              <w:lang w:val="es-CL"/>
+              <w14:ligatures w14:val="standardContextual"/>
             </w:rPr>
           </w:pPr>
-          <w:hyperlink w:anchor="_heading=h.jmr9zdfeewiv">
-            <w:r>
-              <w:rPr>
-                <w:rFonts w:ascii="Arial" w:eastAsia="Arial" w:hAnsi="Arial" w:cs="Arial"/>
-                <w:color w:val="000000"/>
-              </w:rPr>
-              <w:t>19.1 Listado de tareas por historia de usuario y sprint</w:t>
-            </w:r>
-            <w:r>
-              <w:rPr>
-                <w:rFonts w:ascii="Arial" w:eastAsia="Arial" w:hAnsi="Arial" w:cs="Arial"/>
-                <w:color w:val="000000"/>
+          <w:hyperlink w:anchor="_Toc215668041" w:history="1">
+            <w:r>
+              <w:rPr>
+                <w:rStyle w:val="Hipervnculo"/>
+                <w:noProof/>
+              </w:rPr>
+              <w:t>19.1</w:t>
+            </w:r>
+            <w:r>
+              <w:rPr>
+                <w:rFonts w:asciiTheme="minorHAnsi" w:eastAsiaTheme="minorEastAsia" w:hAnsiTheme="minorHAnsi" w:cstheme="minorBidi"/>
+                <w:b w:val="0"/>
+                <w:smallCaps w:val="0"/>
+                <w:noProof/>
+                <w:kern w:val="2"/>
+                <w:szCs w:val="24"/>
+                <w:lang w:val="es-CL"/>
+                <w14:ligatures w14:val="standardContextual"/>
               </w:rPr>
               <w:tab/>
-              <w:t>17</w:t>
+            </w:r>
+            <w:r>
+              <w:rPr>
+                <w:rStyle w:val="Hipervnculo"/>
+                <w:noProof/>
+              </w:rPr>
+              <w:t>Listado de tareas por historia de usuario y sprint</w:t>
+            </w:r>
+            <w:r>
+              <w:rPr>
+                <w:noProof/>
+                <w:webHidden/>
+              </w:rPr>
+              <w:tab/>
+            </w:r>
+            <w:r>
+              <w:rPr>
+                <w:noProof/>
+                <w:webHidden/>
+              </w:rPr>
+              <w:fldChar w:fldCharType="begin"/>
+            </w:r>
+            <w:r>
+              <w:rPr>
+                <w:noProof/>
+                <w:webHidden/>
+              </w:rPr>
+              <w:instrText xml:space="preserve"> PAGEREF _Toc215668041 \h </w:instrText>
+            </w:r>
+            <w:r>
+              <w:rPr>
+                <w:noProof/>
+                <w:webHidden/>
+              </w:rPr>
+            </w:r>
+            <w:r>
+              <w:rPr>
+                <w:noProof/>
+                <w:webHidden/>
+              </w:rPr>
+              <w:fldChar w:fldCharType="separate"/>
+            </w:r>
+            <w:r>
+              <w:rPr>
+                <w:noProof/>
+                <w:webHidden/>
+              </w:rPr>
+              <w:t>16</w:t>
+            </w:r>
+            <w:r>
+              <w:rPr>
+                <w:noProof/>
+                <w:webHidden/>
+              </w:rPr>
+              <w:fldChar w:fldCharType="end"/>
             </w:r>
           </w:hyperlink>
+        </w:p>
+        <w:p>
+          <w:pPr>
+            <w:pStyle w:val="TDC2"/>
+            <w:tabs>
+              <w:tab w:val="left" w:pos="1100"/>
+              <w:tab w:val="right" w:leader="dot" w:pos="9678"/>
+            </w:tabs>
+            <w:rPr>
+              <w:rFonts w:asciiTheme="minorHAnsi" w:eastAsiaTheme="minorEastAsia" w:hAnsiTheme="minorHAnsi" w:cstheme="minorBidi"/>
+              <w:b w:val="0"/>
+              <w:smallCaps w:val="0"/>
+              <w:noProof/>
+              <w:kern w:val="2"/>
+              <w:szCs w:val="24"/>
+              <w:lang w:val="es-CL"/>
+              <w14:ligatures w14:val="standardContextual"/>
+            </w:rPr>
+          </w:pPr>
+          <w:hyperlink w:anchor="_Toc215668042" w:history="1">
+            <w:r>
+              <w:rPr>
+                <w:rStyle w:val="Hipervnculo"/>
+                <w:noProof/>
+              </w:rPr>
+              <w:t>19.2</w:t>
+            </w:r>
+            <w:r>
+              <w:rPr>
+                <w:rFonts w:asciiTheme="minorHAnsi" w:eastAsiaTheme="minorEastAsia" w:hAnsiTheme="minorHAnsi" w:cstheme="minorBidi"/>
+                <w:b w:val="0"/>
+                <w:smallCaps w:val="0"/>
+                <w:noProof/>
+                <w:kern w:val="2"/>
+                <w:szCs w:val="24"/>
+                <w:lang w:val="es-CL"/>
+                <w14:ligatures w14:val="standardContextual"/>
+              </w:rPr>
+              <w:tab/>
+            </w:r>
+            <w:r>
+              <w:rPr>
+                <w:rStyle w:val="Hipervnculo"/>
+                <w:noProof/>
+              </w:rPr>
+              <w:t>Relación con la planificación del proyecto</w:t>
+            </w:r>
+            <w:r>
+              <w:rPr>
+                <w:noProof/>
+                <w:webHidden/>
+              </w:rPr>
+              <w:tab/>
+            </w:r>
+            <w:r>
+              <w:rPr>
+                <w:noProof/>
+                <w:webHidden/>
+              </w:rPr>
+              <w:fldChar w:fldCharType="begin"/>
+            </w:r>
+            <w:r>
+              <w:rPr>
+                <w:noProof/>
+                <w:webHidden/>
+              </w:rPr>
+              <w:instrText xml:space="preserve"> PAGEREF _Toc215668042 \h </w:instrText>
+            </w:r>
+            <w:r>
+              <w:rPr>
+                <w:noProof/>
+                <w:webHidden/>
+              </w:rPr>
+            </w:r>
+            <w:r>
+              <w:rPr>
+                <w:noProof/>
+                <w:webHidden/>
+              </w:rPr>
+              <w:fldChar w:fldCharType="separate"/>
+            </w:r>
+            <w:r>
+              <w:rPr>
+                <w:noProof/>
+                <w:webHidden/>
+              </w:rPr>
+              <w:t>20</w:t>
+            </w:r>
+            <w:r>
+              <w:rPr>
+                <w:noProof/>
+                <w:webHidden/>
+              </w:rPr>
+              <w:fldChar w:fldCharType="end"/>
+            </w:r>
+          </w:hyperlink>
+        </w:p>
+        <w:p>
           <w:r>
+            <w:rPr>
+              <w:rFonts w:ascii="Proxima Nova" w:hAnsi="Proxima Nova"/>
+              <w:b/>
+              <w:bCs/>
+              <w:sz w:val="24"/>
+              <w:szCs w:val="24"/>
+              <w:lang w:val="es-ES"/>
+            </w:rPr>
             <w:fldChar w:fldCharType="end"/>
           </w:r>
         </w:p>
@@ -1650,6 +3312,18 @@
           <w:tab w:val="left" w:pos="851"/>
           <w:tab w:val="left" w:pos="1701"/>
           <w:tab w:val="left" w:pos="2552"/>
+          <w:tab w:val="left" w:pos="851"/>
+          <w:tab w:val="left" w:pos="1701"/>
+          <w:tab w:val="left" w:pos="2552"/>
+          <w:tab w:val="left" w:pos="851"/>
+          <w:tab w:val="left" w:pos="1701"/>
+          <w:tab w:val="left" w:pos="2552"/>
+          <w:tab w:val="left" w:pos="851"/>
+          <w:tab w:val="left" w:pos="1701"/>
+          <w:tab w:val="left" w:pos="2552"/>
+          <w:tab w:val="left" w:pos="851"/>
+          <w:tab w:val="left" w:pos="1701"/>
+          <w:tab w:val="left" w:pos="2552"/>
         </w:tabs>
       </w:pPr>
     </w:p>
@@ -1659,138 +3333,6 @@
           <w:tab w:val="left" w:pos="851"/>
           <w:tab w:val="left" w:pos="1701"/>
           <w:tab w:val="left" w:pos="2552"/>
-        </w:tabs>
-      </w:pPr>
-    </w:p>
-    <w:p>
-      <w:pPr>
-        <w:tabs>
-          <w:tab w:val="left" w:pos="851"/>
-          <w:tab w:val="left" w:pos="1701"/>
-          <w:tab w:val="left" w:pos="2552"/>
-        </w:tabs>
-      </w:pPr>
-    </w:p>
-    <w:p>
-      <w:pPr>
-        <w:tabs>
-          <w:tab w:val="left" w:pos="851"/>
-          <w:tab w:val="left" w:pos="1701"/>
-          <w:tab w:val="left" w:pos="2552"/>
-        </w:tabs>
-      </w:pPr>
-    </w:p>
-    <w:p>
-      <w:pPr>
-        <w:tabs>
-          <w:tab w:val="left" w:pos="851"/>
-          <w:tab w:val="left" w:pos="1701"/>
-          <w:tab w:val="left" w:pos="2552"/>
-        </w:tabs>
-      </w:pPr>
-    </w:p>
-    <w:p>
-      <w:pPr>
-        <w:tabs>
-          <w:tab w:val="left" w:pos="851"/>
-          <w:tab w:val="left" w:pos="1701"/>
-          <w:tab w:val="left" w:pos="2552"/>
-        </w:tabs>
-      </w:pPr>
-    </w:p>
-    <w:p>
-      <w:pPr>
-        <w:tabs>
-          <w:tab w:val="left" w:pos="851"/>
-          <w:tab w:val="left" w:pos="1701"/>
-          <w:tab w:val="left" w:pos="2552"/>
-        </w:tabs>
-      </w:pPr>
-    </w:p>
-    <w:p>
-      <w:pPr>
-        <w:tabs>
-          <w:tab w:val="left" w:pos="851"/>
-          <w:tab w:val="left" w:pos="1701"/>
-          <w:tab w:val="left" w:pos="2552"/>
-        </w:tabs>
-      </w:pPr>
-    </w:p>
-    <w:p>
-      <w:pPr>
-        <w:tabs>
-          <w:tab w:val="left" w:pos="851"/>
-          <w:tab w:val="left" w:pos="1701"/>
-          <w:tab w:val="left" w:pos="2552"/>
-        </w:tabs>
-      </w:pPr>
-    </w:p>
-    <w:p>
-      <w:pPr>
-        <w:tabs>
-          <w:tab w:val="left" w:pos="851"/>
-          <w:tab w:val="left" w:pos="1701"/>
-          <w:tab w:val="left" w:pos="2552"/>
-        </w:tabs>
-      </w:pPr>
-    </w:p>
-    <w:p>
-      <w:pPr>
-        <w:tabs>
-          <w:tab w:val="left" w:pos="851"/>
-          <w:tab w:val="left" w:pos="1701"/>
-          <w:tab w:val="left" w:pos="2552"/>
-        </w:tabs>
-      </w:pPr>
-    </w:p>
-    <w:p>
-      <w:pPr>
-        <w:tabs>
-          <w:tab w:val="left" w:pos="851"/>
-          <w:tab w:val="left" w:pos="1701"/>
-          <w:tab w:val="left" w:pos="2552"/>
-          <w:tab w:val="left" w:pos="851"/>
-          <w:tab w:val="left" w:pos="1701"/>
-          <w:tab w:val="left" w:pos="2552"/>
-          <w:tab w:val="left" w:pos="851"/>
-          <w:tab w:val="left" w:pos="1701"/>
-          <w:tab w:val="left" w:pos="2552"/>
-          <w:tab w:val="left" w:pos="851"/>
-          <w:tab w:val="left" w:pos="1701"/>
-          <w:tab w:val="left" w:pos="2552"/>
-          <w:tab w:val="left" w:pos="851"/>
-          <w:tab w:val="left" w:pos="1701"/>
-          <w:tab w:val="left" w:pos="2552"/>
-        </w:tabs>
-      </w:pPr>
-    </w:p>
-    <w:p>
-      <w:pPr>
-        <w:tabs>
-          <w:tab w:val="left" w:pos="851"/>
-          <w:tab w:val="left" w:pos="1701"/>
-          <w:tab w:val="left" w:pos="2552"/>
-          <w:tab w:val="left" w:pos="851"/>
-          <w:tab w:val="left" w:pos="1701"/>
-          <w:tab w:val="left" w:pos="2552"/>
-          <w:tab w:val="left" w:pos="851"/>
-          <w:tab w:val="left" w:pos="1701"/>
-          <w:tab w:val="left" w:pos="2552"/>
-          <w:tab w:val="left" w:pos="851"/>
-          <w:tab w:val="left" w:pos="1701"/>
-          <w:tab w:val="left" w:pos="2552"/>
-          <w:tab w:val="left" w:pos="851"/>
-          <w:tab w:val="left" w:pos="1701"/>
-          <w:tab w:val="left" w:pos="2552"/>
-        </w:tabs>
-      </w:pPr>
-    </w:p>
-    <w:p>
-      <w:pPr>
-        <w:tabs>
-          <w:tab w:val="left" w:pos="851"/>
-          <w:tab w:val="left" w:pos="1701"/>
-          <w:tab w:val="left" w:pos="2552"/>
           <w:tab w:val="left" w:pos="851"/>
           <w:tab w:val="left" w:pos="1701"/>
           <w:tab w:val="left" w:pos="2552"/>
@@ -1809,11 +3351,6 @@
     <w:p>
       <w:pPr>
         <w:pStyle w:val="Ttulo1"/>
-        <w:tabs>
-          <w:tab w:val="left" w:pos="851"/>
-          <w:tab w:val="left" w:pos="1701"/>
-          <w:tab w:val="left" w:pos="2552"/>
-        </w:tabs>
         <w:ind w:left="0" w:firstLine="0"/>
         <w:rPr>
           <w:rFonts w:ascii="Arial" w:eastAsia="Arial" w:hAnsi="Arial" w:cs="Arial"/>
@@ -1830,27 +3367,23 @@
           <w:ilvl w:val="0"/>
           <w:numId w:val="3"/>
         </w:numPr>
-        <w:tabs>
-          <w:tab w:val="left" w:pos="851"/>
-          <w:tab w:val="left" w:pos="1701"/>
-          <w:tab w:val="left" w:pos="2552"/>
-        </w:tabs>
         <w:rPr>
           <w:b/>
           <w:bCs/>
           <w:color w:val="17365D"/>
         </w:rPr>
       </w:pPr>
-      <w:bookmarkStart w:id="2" w:name="_heading=h.zaqqlbpohtcj" w:colFirst="0" w:colLast="0"/>
-      <w:bookmarkEnd w:id="2"/>
+      <w:bookmarkStart w:id="2" w:name="_Toc215668019"/>
       <w:r>
         <w:rPr>
           <w:b/>
           <w:bCs/>
           <w:color w:val="17365D"/>
         </w:rPr>
+        <w:lastRenderedPageBreak/>
         <w:t>Introducción</w:t>
       </w:r>
+      <w:bookmarkEnd w:id="2"/>
     </w:p>
     <w:p>
       <w:pPr>
@@ -1932,11 +3465,6 @@
     <w:p>
       <w:pPr>
         <w:pStyle w:val="Ttulo1"/>
-        <w:tabs>
-          <w:tab w:val="left" w:pos="851"/>
-          <w:tab w:val="left" w:pos="1701"/>
-          <w:tab w:val="left" w:pos="2552"/>
-        </w:tabs>
         <w:ind w:left="720" w:firstLine="0"/>
         <w:rPr>
           <w:b/>
@@ -1962,19 +3490,13 @@
           <w:ilvl w:val="0"/>
           <w:numId w:val="3"/>
         </w:numPr>
-        <w:tabs>
-          <w:tab w:val="left" w:pos="851"/>
-          <w:tab w:val="left" w:pos="1701"/>
-          <w:tab w:val="left" w:pos="2552"/>
-        </w:tabs>
         <w:rPr>
           <w:b/>
           <w:bCs/>
           <w:color w:val="17365D"/>
         </w:rPr>
       </w:pPr>
-      <w:bookmarkStart w:id="4" w:name="_heading=h.vxbc3iw7uoy" w:colFirst="0" w:colLast="0"/>
-      <w:bookmarkEnd w:id="4"/>
+      <w:bookmarkStart w:id="4" w:name="_Toc215668020"/>
       <w:r>
         <w:rPr>
           <w:b/>
@@ -1983,6 +3505,7 @@
         </w:rPr>
         <w:t>Datos del documento</w:t>
       </w:r>
+      <w:bookmarkEnd w:id="4"/>
     </w:p>
     <w:p>
       <w:pPr>
@@ -2014,16 +3537,24 @@
           <w:szCs w:val="26"/>
         </w:rPr>
       </w:pPr>
-      <w:bookmarkStart w:id="5" w:name="_heading=h.xs5y54s10hqp" w:colFirst="0" w:colLast="0"/>
-      <w:bookmarkEnd w:id="5"/>
       <w:r>
         <w:rPr>
           <w:rFonts w:ascii="Proxima Nova" w:eastAsia="Proxima Nova" w:hAnsi="Proxima Nova" w:cs="Proxima Nova"/>
           <w:sz w:val="26"/>
           <w:szCs w:val="26"/>
         </w:rPr>
-        <w:t xml:space="preserve"> Histórico de Revisiones</w:t>
+        <w:t xml:space="preserve"> </w:t>
       </w:r>
+      <w:bookmarkStart w:id="5" w:name="_Toc215668021"/>
+      <w:r>
+        <w:rPr>
+          <w:rFonts w:ascii="Proxima Nova" w:eastAsia="Proxima Nova" w:hAnsi="Proxima Nova" w:cs="Proxima Nova"/>
+          <w:sz w:val="26"/>
+          <w:szCs w:val="26"/>
+        </w:rPr>
+        <w:t>Histórico de Revisiones</w:t>
+      </w:r>
+      <w:bookmarkEnd w:id="5"/>
     </w:p>
     <w:tbl>
       <w:tblPr>
@@ -2212,7 +3743,31 @@
                 <w:sz w:val="24"/>
                 <w:szCs w:val="24"/>
               </w:rPr>
-              <w:t>10/10/2025</w:t>
+              <w:t>22</w:t>
+            </w:r>
+            <w:r>
+              <w:rPr>
+                <w:rFonts w:ascii="Proxima Nova" w:eastAsia="Proxima Nova" w:hAnsi="Proxima Nova" w:cs="Proxima Nova"/>
+                <w:sz w:val="24"/>
+                <w:szCs w:val="24"/>
+              </w:rPr>
+              <w:t>/</w:t>
+            </w:r>
+            <w:r>
+              <w:rPr>
+                <w:rFonts w:ascii="Proxima Nova" w:eastAsia="Proxima Nova" w:hAnsi="Proxima Nova" w:cs="Proxima Nova"/>
+                <w:sz w:val="24"/>
+                <w:szCs w:val="24"/>
+              </w:rPr>
+              <w:t>09</w:t>
+            </w:r>
+            <w:r>
+              <w:rPr>
+                <w:rFonts w:ascii="Proxima Nova" w:eastAsia="Proxima Nova" w:hAnsi="Proxima Nova" w:cs="Proxima Nova"/>
+                <w:sz w:val="24"/>
+                <w:szCs w:val="24"/>
+              </w:rPr>
+              <w:t>/2025</w:t>
             </w:r>
           </w:p>
         </w:tc>
@@ -2451,16 +4006,24 @@
           <w:szCs w:val="26"/>
         </w:rPr>
       </w:pPr>
-      <w:bookmarkStart w:id="7" w:name="_heading=h.lzhi6m8fos9u" w:colFirst="0" w:colLast="0"/>
-      <w:bookmarkEnd w:id="7"/>
       <w:r>
         <w:rPr>
           <w:rFonts w:ascii="Proxima Nova" w:eastAsia="Proxima Nova" w:hAnsi="Proxima Nova" w:cs="Proxima Nova"/>
           <w:sz w:val="26"/>
           <w:szCs w:val="26"/>
         </w:rPr>
-        <w:t xml:space="preserve"> Información del Proyecto</w:t>
+        <w:t xml:space="preserve"> </w:t>
       </w:r>
+      <w:bookmarkStart w:id="7" w:name="_Toc215668022"/>
+      <w:r>
+        <w:rPr>
+          <w:rFonts w:ascii="Proxima Nova" w:eastAsia="Proxima Nova" w:hAnsi="Proxima Nova" w:cs="Proxima Nova"/>
+          <w:sz w:val="26"/>
+          <w:szCs w:val="26"/>
+        </w:rPr>
+        <w:t>Información del Proyecto</w:t>
+      </w:r>
+      <w:bookmarkEnd w:id="7"/>
     </w:p>
     <w:tbl>
       <w:tblPr>
@@ -2730,16 +4293,24 @@
           <w:szCs w:val="26"/>
         </w:rPr>
       </w:pPr>
-      <w:bookmarkStart w:id="9" w:name="_heading=h.5ucrh5wn1okx" w:colFirst="0" w:colLast="0"/>
-      <w:bookmarkEnd w:id="9"/>
       <w:r>
         <w:rPr>
           <w:rFonts w:ascii="Proxima Nova" w:eastAsia="Proxima Nova" w:hAnsi="Proxima Nova" w:cs="Proxima Nova"/>
           <w:sz w:val="26"/>
           <w:szCs w:val="26"/>
         </w:rPr>
-        <w:t xml:space="preserve"> Integrantes</w:t>
+        <w:t xml:space="preserve"> </w:t>
       </w:r>
+      <w:bookmarkStart w:id="9" w:name="_Toc215668023"/>
+      <w:r>
+        <w:rPr>
+          <w:rFonts w:ascii="Proxima Nova" w:eastAsia="Proxima Nova" w:hAnsi="Proxima Nova" w:cs="Proxima Nova"/>
+          <w:sz w:val="26"/>
+          <w:szCs w:val="26"/>
+        </w:rPr>
+        <w:t>Integrantes</w:t>
+      </w:r>
+      <w:bookmarkEnd w:id="9"/>
     </w:p>
     <w:tbl>
       <w:tblPr>
@@ -3083,12 +4654,7 @@
     <w:p/>
     <w:p/>
     <w:p/>
-    <w:p>
-      <w:r>
-        <w:lastRenderedPageBreak/>
-        <w:br w:type="page"/>
-      </w:r>
-    </w:p>
+    <w:p/>
     <w:p/>
     <w:p>
       <w:pPr>
@@ -3097,11 +4663,6 @@
           <w:ilvl w:val="0"/>
           <w:numId w:val="3"/>
         </w:numPr>
-        <w:tabs>
-          <w:tab w:val="left" w:pos="851"/>
-          <w:tab w:val="left" w:pos="1701"/>
-          <w:tab w:val="left" w:pos="2552"/>
-        </w:tabs>
         <w:jc w:val="both"/>
         <w:rPr>
           <w:b/>
@@ -3109,7 +4670,16 @@
           <w:color w:val="17365D"/>
         </w:rPr>
       </w:pPr>
-      <w:bookmarkStart w:id="11" w:name="_heading=h.91h7nijy7v01" w:colFirst="0" w:colLast="0"/>
+      <w:bookmarkStart w:id="11" w:name="_Toc215668024"/>
+      <w:r>
+        <w:rPr>
+          <w:b/>
+          <w:bCs/>
+          <w:color w:val="17365D"/>
+        </w:rPr>
+        <w:lastRenderedPageBreak/>
+        <w:t>Información del Proyecto</w:t>
+      </w:r>
       <w:bookmarkEnd w:id="11"/>
       <w:r>
         <w:rPr>
@@ -3117,7 +4687,7 @@
           <w:bCs/>
           <w:color w:val="17365D"/>
         </w:rPr>
-        <w:t xml:space="preserve">Información del Proyecto </w:t>
+        <w:t xml:space="preserve"> </w:t>
       </w:r>
     </w:p>
     <w:p>
@@ -3241,11 +4811,6 @@
           <w:ilvl w:val="0"/>
           <w:numId w:val="3"/>
         </w:numPr>
-        <w:tabs>
-          <w:tab w:val="left" w:pos="851"/>
-          <w:tab w:val="left" w:pos="1701"/>
-          <w:tab w:val="left" w:pos="2552"/>
-        </w:tabs>
         <w:jc w:val="both"/>
         <w:rPr>
           <w:b/>
@@ -3253,8 +4818,7 @@
           <w:color w:val="17365D"/>
         </w:rPr>
       </w:pPr>
-      <w:bookmarkStart w:id="12" w:name="_heading=h.fq3r34mfa3hl" w:colFirst="0" w:colLast="0"/>
-      <w:bookmarkEnd w:id="12"/>
+      <w:bookmarkStart w:id="12" w:name="_Toc215668025"/>
       <w:r>
         <w:rPr>
           <w:b/>
@@ -3263,6 +4827,7 @@
         </w:rPr>
         <w:t>Propósito del plan de proyecto</w:t>
       </w:r>
+      <w:bookmarkEnd w:id="12"/>
     </w:p>
     <w:p>
       <w:pPr>
@@ -3369,11 +4934,6 @@
           <w:ilvl w:val="0"/>
           <w:numId w:val="3"/>
         </w:numPr>
-        <w:tabs>
-          <w:tab w:val="left" w:pos="851"/>
-          <w:tab w:val="left" w:pos="1701"/>
-          <w:tab w:val="left" w:pos="2552"/>
-        </w:tabs>
         <w:jc w:val="both"/>
         <w:rPr>
           <w:b/>
@@ -3381,7 +4941,15 @@
           <w:color w:val="17365D"/>
         </w:rPr>
       </w:pPr>
-      <w:bookmarkStart w:id="13" w:name="_heading=h.sygqjjdoioo5" w:colFirst="0" w:colLast="0"/>
+      <w:bookmarkStart w:id="13" w:name="_Toc215668026"/>
+      <w:r>
+        <w:rPr>
+          <w:b/>
+          <w:bCs/>
+          <w:color w:val="17365D"/>
+        </w:rPr>
+        <w:t>Visión del Proyecto Scrum</w:t>
+      </w:r>
       <w:bookmarkEnd w:id="13"/>
       <w:r>
         <w:rPr>
@@ -3389,7 +4957,7 @@
           <w:bCs/>
           <w:color w:val="17365D"/>
         </w:rPr>
-        <w:t xml:space="preserve">Visión del Proyecto Scrum </w:t>
+        <w:t xml:space="preserve"> </w:t>
       </w:r>
     </w:p>
     <w:p>
@@ -3508,11 +5076,6 @@
           <w:ilvl w:val="0"/>
           <w:numId w:val="3"/>
         </w:numPr>
-        <w:tabs>
-          <w:tab w:val="left" w:pos="851"/>
-          <w:tab w:val="left" w:pos="1701"/>
-          <w:tab w:val="left" w:pos="2552"/>
-        </w:tabs>
         <w:jc w:val="both"/>
         <w:rPr>
           <w:b/>
@@ -3520,8 +5083,7 @@
           <w:color w:val="17365D"/>
         </w:rPr>
       </w:pPr>
-      <w:bookmarkStart w:id="14" w:name="_heading=h.3vo99y9wakvb" w:colFirst="0" w:colLast="0"/>
-      <w:bookmarkEnd w:id="14"/>
+      <w:bookmarkStart w:id="14" w:name="_Toc215668027"/>
       <w:r>
         <w:rPr>
           <w:b/>
@@ -3530,6 +5092,7 @@
         </w:rPr>
         <w:t>Alcance del proyecto</w:t>
       </w:r>
+      <w:bookmarkEnd w:id="14"/>
     </w:p>
     <w:p>
       <w:pPr>
@@ -3732,11 +5295,6 @@
           <w:ilvl w:val="0"/>
           <w:numId w:val="3"/>
         </w:numPr>
-        <w:tabs>
-          <w:tab w:val="left" w:pos="851"/>
-          <w:tab w:val="left" w:pos="1701"/>
-          <w:tab w:val="left" w:pos="2552"/>
-        </w:tabs>
         <w:jc w:val="both"/>
         <w:rPr>
           <w:b/>
@@ -3744,8 +5302,7 @@
           <w:color w:val="17365D"/>
         </w:rPr>
       </w:pPr>
-      <w:bookmarkStart w:id="15" w:name="_heading=h.d3dpoxcrlp2p" w:colFirst="0" w:colLast="0"/>
-      <w:bookmarkEnd w:id="15"/>
+      <w:bookmarkStart w:id="15" w:name="_Toc215668028"/>
       <w:r>
         <w:rPr>
           <w:b/>
@@ -3754,6 +5311,7 @@
         </w:rPr>
         <w:t>Metodología de desarrollo</w:t>
       </w:r>
+      <w:bookmarkEnd w:id="15"/>
     </w:p>
     <w:p>
       <w:pPr>
@@ -3876,11 +5434,6 @@
           <w:ilvl w:val="0"/>
           <w:numId w:val="3"/>
         </w:numPr>
-        <w:tabs>
-          <w:tab w:val="left" w:pos="851"/>
-          <w:tab w:val="left" w:pos="1701"/>
-          <w:tab w:val="left" w:pos="2552"/>
-        </w:tabs>
         <w:jc w:val="both"/>
         <w:rPr>
           <w:b/>
@@ -3888,8 +5441,7 @@
           <w:color w:val="17365D"/>
         </w:rPr>
       </w:pPr>
-      <w:bookmarkStart w:id="16" w:name="_heading=h.9d74taimgz59" w:colFirst="0" w:colLast="0"/>
-      <w:bookmarkEnd w:id="16"/>
+      <w:bookmarkStart w:id="16" w:name="_Toc215668029"/>
       <w:r>
         <w:rPr>
           <w:b/>
@@ -3898,6 +5450,7 @@
         </w:rPr>
         <w:t>Definición de Roles y responsabilidades</w:t>
       </w:r>
+      <w:bookmarkEnd w:id="16"/>
     </w:p>
     <w:p>
       <w:pPr>
@@ -5571,11 +7124,6 @@
           <w:ilvl w:val="0"/>
           <w:numId w:val="3"/>
         </w:numPr>
-        <w:tabs>
-          <w:tab w:val="left" w:pos="851"/>
-          <w:tab w:val="left" w:pos="1701"/>
-          <w:tab w:val="left" w:pos="2552"/>
-        </w:tabs>
         <w:jc w:val="both"/>
         <w:rPr>
           <w:b/>
@@ -5583,8 +7131,7 @@
           <w:color w:val="17365D"/>
         </w:rPr>
       </w:pPr>
-      <w:bookmarkStart w:id="17" w:name="_heading=h.5104am838nal" w:colFirst="0" w:colLast="0"/>
-      <w:bookmarkEnd w:id="17"/>
+      <w:bookmarkStart w:id="17" w:name="_Toc215668030"/>
       <w:r>
         <w:rPr>
           <w:b/>
@@ -5593,6 +7140,7 @@
         </w:rPr>
         <w:t>Costos</w:t>
       </w:r>
+      <w:bookmarkEnd w:id="17"/>
     </w:p>
     <w:p>
       <w:pPr>
@@ -6604,11 +8152,6 @@
           <w:ilvl w:val="0"/>
           <w:numId w:val="3"/>
         </w:numPr>
-        <w:tabs>
-          <w:tab w:val="left" w:pos="851"/>
-          <w:tab w:val="left" w:pos="1701"/>
-          <w:tab w:val="left" w:pos="2552"/>
-        </w:tabs>
         <w:jc w:val="both"/>
         <w:rPr>
           <w:b/>
@@ -6616,8 +8159,7 @@
           <w:color w:val="17365D"/>
         </w:rPr>
       </w:pPr>
-      <w:bookmarkStart w:id="18" w:name="_heading=h.ebe2ri4hlvt" w:colFirst="0" w:colLast="0"/>
-      <w:bookmarkEnd w:id="18"/>
+      <w:bookmarkStart w:id="18" w:name="_Toc215668031"/>
       <w:r>
         <w:rPr>
           <w:b/>
@@ -6627,6 +8169,7 @@
         <w:lastRenderedPageBreak/>
         <w:t>Casos de prueba</w:t>
       </w:r>
+      <w:bookmarkEnd w:id="18"/>
     </w:p>
     <w:p>
       <w:pPr>
@@ -11127,11 +12670,6 @@
           <w:ilvl w:val="0"/>
           <w:numId w:val="3"/>
         </w:numPr>
-        <w:tabs>
-          <w:tab w:val="left" w:pos="851"/>
-          <w:tab w:val="left" w:pos="1701"/>
-          <w:tab w:val="left" w:pos="2552"/>
-        </w:tabs>
         <w:jc w:val="both"/>
         <w:rPr>
           <w:b/>
@@ -11139,8 +12677,7 @@
           <w:color w:val="17365D"/>
         </w:rPr>
       </w:pPr>
-      <w:bookmarkStart w:id="19" w:name="_heading=h.mp1jhes6wqoy" w:colFirst="0" w:colLast="0"/>
-      <w:bookmarkEnd w:id="19"/>
+      <w:bookmarkStart w:id="19" w:name="_Toc215668032"/>
       <w:r>
         <w:rPr>
           <w:b/>
@@ -11149,6 +12686,7 @@
         </w:rPr>
         <w:t>Resumen de riesgos</w:t>
       </w:r>
+      <w:bookmarkEnd w:id="19"/>
     </w:p>
     <w:p>
       <w:pPr>
@@ -14798,11 +16336,6 @@
           <w:ilvl w:val="0"/>
           <w:numId w:val="3"/>
         </w:numPr>
-        <w:tabs>
-          <w:tab w:val="left" w:pos="851"/>
-          <w:tab w:val="left" w:pos="1701"/>
-          <w:tab w:val="left" w:pos="2552"/>
-        </w:tabs>
         <w:jc w:val="both"/>
         <w:rPr>
           <w:b/>
@@ -14810,8 +16343,7 @@
           <w:color w:val="17365D"/>
         </w:rPr>
       </w:pPr>
-      <w:bookmarkStart w:id="20" w:name="_heading=h.iczy5v4ygug0" w:colFirst="0" w:colLast="0"/>
-      <w:bookmarkEnd w:id="20"/>
+      <w:bookmarkStart w:id="20" w:name="_Toc215668033"/>
       <w:r>
         <w:rPr>
           <w:b/>
@@ -14821,6 +16353,7 @@
         <w:lastRenderedPageBreak/>
         <w:t>Épicas para el proyecto</w:t>
       </w:r>
+      <w:bookmarkEnd w:id="20"/>
     </w:p>
     <w:p>
       <w:pPr>
@@ -15551,11 +17084,6 @@
           <w:ilvl w:val="0"/>
           <w:numId w:val="3"/>
         </w:numPr>
-        <w:tabs>
-          <w:tab w:val="left" w:pos="851"/>
-          <w:tab w:val="left" w:pos="1701"/>
-          <w:tab w:val="left" w:pos="2552"/>
-        </w:tabs>
         <w:jc w:val="both"/>
         <w:rPr>
           <w:b/>
@@ -15563,7 +17091,15 @@
           <w:color w:val="17365D"/>
         </w:rPr>
       </w:pPr>
-      <w:bookmarkStart w:id="21" w:name="_heading=h.kbte225gbh0l" w:colFirst="0" w:colLast="0"/>
+      <w:bookmarkStart w:id="21" w:name="_Toc215668034"/>
+      <w:r>
+        <w:rPr>
+          <w:b/>
+          <w:bCs/>
+          <w:color w:val="17365D"/>
+        </w:rPr>
+        <w:t>Priorización de Épicas</w:t>
+      </w:r>
       <w:bookmarkEnd w:id="21"/>
       <w:r>
         <w:rPr>
@@ -15571,7 +17107,7 @@
           <w:bCs/>
           <w:color w:val="17365D"/>
         </w:rPr>
-        <w:t xml:space="preserve">Priorización de Épicas </w:t>
+        <w:t xml:space="preserve"> </w:t>
       </w:r>
     </w:p>
     <w:p>
@@ -17192,11 +18728,6 @@
           <w:ilvl w:val="0"/>
           <w:numId w:val="3"/>
         </w:numPr>
-        <w:tabs>
-          <w:tab w:val="left" w:pos="851"/>
-          <w:tab w:val="left" w:pos="1701"/>
-          <w:tab w:val="left" w:pos="2552"/>
-        </w:tabs>
         <w:jc w:val="both"/>
         <w:rPr>
           <w:b/>
@@ -17204,7 +18735,16 @@
           <w:color w:val="17365D"/>
         </w:rPr>
       </w:pPr>
-      <w:bookmarkStart w:id="22" w:name="_heading=h.cxzc1j9jhqh9" w:colFirst="0" w:colLast="0"/>
+      <w:bookmarkStart w:id="22" w:name="_Toc215668035"/>
+      <w:r>
+        <w:rPr>
+          <w:b/>
+          <w:bCs/>
+          <w:color w:val="17365D"/>
+        </w:rPr>
+        <w:lastRenderedPageBreak/>
+        <w:t>Definición de Historias de Usuario</w:t>
+      </w:r>
       <w:bookmarkEnd w:id="22"/>
       <w:r>
         <w:rPr>
@@ -17212,8 +18752,7 @@
           <w:bCs/>
           <w:color w:val="17365D"/>
         </w:rPr>
-        <w:lastRenderedPageBreak/>
-        <w:t xml:space="preserve">Definición de Historias de Usuario </w:t>
+        <w:t xml:space="preserve"> </w:t>
       </w:r>
     </w:p>
     <w:p>
@@ -20541,11 +22080,6 @@
           <w:ilvl w:val="0"/>
           <w:numId w:val="3"/>
         </w:numPr>
-        <w:tabs>
-          <w:tab w:val="left" w:pos="851"/>
-          <w:tab w:val="left" w:pos="1701"/>
-          <w:tab w:val="left" w:pos="2552"/>
-        </w:tabs>
         <w:jc w:val="both"/>
         <w:rPr>
           <w:b/>
@@ -20553,8 +22087,7 @@
           <w:color w:val="17365D"/>
         </w:rPr>
       </w:pPr>
-      <w:bookmarkStart w:id="23" w:name="_heading=h.wtbo2yylrfa9" w:colFirst="0" w:colLast="0"/>
-      <w:bookmarkEnd w:id="23"/>
+      <w:bookmarkStart w:id="23" w:name="_Toc215668036"/>
       <w:proofErr w:type="spellStart"/>
       <w:r>
         <w:rPr>
@@ -20571,7 +22104,16 @@
           <w:bCs/>
           <w:color w:val="17365D"/>
         </w:rPr>
-        <w:t xml:space="preserve"> Backlog del Proyecto </w:t>
+        <w:t xml:space="preserve"> Backlog del Proyecto</w:t>
+      </w:r>
+      <w:bookmarkEnd w:id="23"/>
+      <w:r>
+        <w:rPr>
+          <w:b/>
+          <w:bCs/>
+          <w:color w:val="17365D"/>
+        </w:rPr>
+        <w:t xml:space="preserve"> </w:t>
       </w:r>
     </w:p>
     <w:p>
@@ -24644,11 +26186,6 @@
           <w:ilvl w:val="0"/>
           <w:numId w:val="3"/>
         </w:numPr>
-        <w:tabs>
-          <w:tab w:val="left" w:pos="851"/>
-          <w:tab w:val="left" w:pos="1701"/>
-          <w:tab w:val="left" w:pos="2552"/>
-        </w:tabs>
         <w:jc w:val="both"/>
         <w:rPr>
           <w:b/>
@@ -24656,7 +26193,16 @@
           <w:color w:val="17365D"/>
         </w:rPr>
       </w:pPr>
-      <w:bookmarkStart w:id="24" w:name="_heading=h.ihj64vcnk0i" w:colFirst="0" w:colLast="0"/>
+      <w:bookmarkStart w:id="24" w:name="_Toc215668037"/>
+      <w:r>
+        <w:rPr>
+          <w:b/>
+          <w:bCs/>
+          <w:color w:val="17365D"/>
+        </w:rPr>
+        <w:lastRenderedPageBreak/>
+        <w:t>Estimación de puntos de historia.</w:t>
+      </w:r>
       <w:bookmarkEnd w:id="24"/>
       <w:r>
         <w:rPr>
@@ -24664,8 +26210,7 @@
           <w:bCs/>
           <w:color w:val="17365D"/>
         </w:rPr>
-        <w:lastRenderedPageBreak/>
-        <w:t xml:space="preserve">Estimación de puntos de historia. </w:t>
+        <w:t xml:space="preserve"> </w:t>
       </w:r>
     </w:p>
     <w:p>
@@ -25529,11 +27074,6 @@
           <w:ilvl w:val="0"/>
           <w:numId w:val="3"/>
         </w:numPr>
-        <w:tabs>
-          <w:tab w:val="left" w:pos="851"/>
-          <w:tab w:val="left" w:pos="1701"/>
-          <w:tab w:val="left" w:pos="2552"/>
-        </w:tabs>
         <w:jc w:val="both"/>
         <w:rPr>
           <w:b/>
@@ -25541,7 +27081,16 @@
           <w:color w:val="17365D"/>
         </w:rPr>
       </w:pPr>
-      <w:bookmarkStart w:id="25" w:name="_heading=h.2sdjgsfmrkll" w:colFirst="0" w:colLast="0"/>
+      <w:bookmarkStart w:id="25" w:name="_Toc215668038"/>
+      <w:r>
+        <w:rPr>
+          <w:b/>
+          <w:bCs/>
+          <w:color w:val="17365D"/>
+        </w:rPr>
+        <w:lastRenderedPageBreak/>
+        <w:t>Técnica de estimación</w:t>
+      </w:r>
       <w:bookmarkEnd w:id="25"/>
       <w:r>
         <w:rPr>
@@ -25549,8 +27098,7 @@
           <w:bCs/>
           <w:color w:val="17365D"/>
         </w:rPr>
-        <w:lastRenderedPageBreak/>
-        <w:t xml:space="preserve">Técnica de estimación </w:t>
+        <w:t xml:space="preserve"> </w:t>
       </w:r>
     </w:p>
     <w:p>
@@ -29846,11 +31394,6 @@
     <w:p>
       <w:pPr>
         <w:pStyle w:val="Ttulo1"/>
-        <w:tabs>
-          <w:tab w:val="left" w:pos="851"/>
-          <w:tab w:val="left" w:pos="1701"/>
-          <w:tab w:val="left" w:pos="2552"/>
-        </w:tabs>
         <w:ind w:left="720" w:firstLine="0"/>
         <w:jc w:val="both"/>
         <w:rPr>
@@ -29872,11 +31415,6 @@
           <w:ilvl w:val="0"/>
           <w:numId w:val="3"/>
         </w:numPr>
-        <w:tabs>
-          <w:tab w:val="left" w:pos="851"/>
-          <w:tab w:val="left" w:pos="1701"/>
-          <w:tab w:val="left" w:pos="2552"/>
-        </w:tabs>
         <w:jc w:val="both"/>
         <w:rPr>
           <w:b/>
@@ -29884,8 +31422,7 @@
           <w:color w:val="17365D"/>
         </w:rPr>
       </w:pPr>
-      <w:bookmarkStart w:id="27" w:name="_heading=h.mvk0prn506cg" w:colFirst="0" w:colLast="0"/>
-      <w:bookmarkEnd w:id="27"/>
+      <w:bookmarkStart w:id="27" w:name="_Toc215668039"/>
       <w:r>
         <w:rPr>
           <w:b/>
@@ -29904,16 +31441,12 @@
         </w:rPr>
         <w:t>Planning</w:t>
       </w:r>
+      <w:bookmarkEnd w:id="27"/>
       <w:proofErr w:type="spellEnd"/>
     </w:p>
     <w:p>
       <w:pPr>
         <w:pStyle w:val="Ttulo1"/>
-        <w:tabs>
-          <w:tab w:val="left" w:pos="851"/>
-          <w:tab w:val="left" w:pos="1701"/>
-          <w:tab w:val="left" w:pos="2552"/>
-        </w:tabs>
         <w:ind w:left="720" w:firstLine="0"/>
         <w:jc w:val="both"/>
         <w:rPr>
@@ -31042,11 +32575,6 @@
     <w:p>
       <w:pPr>
         <w:pStyle w:val="Ttulo1"/>
-        <w:tabs>
-          <w:tab w:val="left" w:pos="851"/>
-          <w:tab w:val="left" w:pos="1701"/>
-          <w:tab w:val="left" w:pos="2552"/>
-        </w:tabs>
         <w:ind w:left="720" w:firstLine="0"/>
         <w:jc w:val="both"/>
         <w:rPr>
@@ -31065,11 +32593,6 @@
           <w:ilvl w:val="0"/>
           <w:numId w:val="3"/>
         </w:numPr>
-        <w:tabs>
-          <w:tab w:val="left" w:pos="851"/>
-          <w:tab w:val="left" w:pos="1701"/>
-          <w:tab w:val="left" w:pos="2552"/>
-        </w:tabs>
         <w:jc w:val="both"/>
         <w:rPr>
           <w:b/>
@@ -31077,8 +32600,7 @@
           <w:color w:val="17365D"/>
         </w:rPr>
       </w:pPr>
-      <w:bookmarkStart w:id="30" w:name="_heading=h.afm4oez6dx52" w:colFirst="0" w:colLast="0"/>
-      <w:bookmarkEnd w:id="30"/>
+      <w:bookmarkStart w:id="30" w:name="_Toc215668040"/>
       <w:r>
         <w:rPr>
           <w:b/>
@@ -31087,6 +32609,7 @@
         </w:rPr>
         <w:t>Definición y estimación de tareas</w:t>
       </w:r>
+      <w:bookmarkEnd w:id="30"/>
     </w:p>
     <w:p>
       <w:pPr>
@@ -31171,8 +32694,7 @@
         </w:tabs>
         <w:jc w:val="both"/>
       </w:pPr>
-      <w:bookmarkStart w:id="31" w:name="_heading=h.jmr9zdfeewiv" w:colFirst="0" w:colLast="0"/>
-      <w:bookmarkEnd w:id="31"/>
+      <w:bookmarkStart w:id="31" w:name="_Toc215668041"/>
       <w:r>
         <w:t>19.1</w:t>
       </w:r>
@@ -31180,6 +32702,7 @@
         <w:tab/>
         <w:t>Listado de tareas por historia de usuario y sprint</w:t>
       </w:r>
+      <w:bookmarkEnd w:id="31"/>
     </w:p>
     <w:p>
       <w:pPr>
@@ -37912,6 +39435,7 @@
         </w:tabs>
       </w:pPr>
       <w:bookmarkStart w:id="32" w:name="_heading=h.104122a6n759" w:colFirst="0" w:colLast="0"/>
+      <w:bookmarkStart w:id="33" w:name="_Toc215668042"/>
       <w:bookmarkEnd w:id="32"/>
       <w:r>
         <w:lastRenderedPageBreak/>
@@ -37921,6 +39445,7 @@
         <w:tab/>
         <w:t>Relación con la planificación del proyecto</w:t>
       </w:r>
+      <w:bookmarkEnd w:id="33"/>
     </w:p>
     <w:p>
       <w:pPr>
@@ -38269,12 +39794,12 @@
       </w:pPr>
     </w:p>
     <w:sectPr>
-      <w:headerReference w:type="even" r:id="rId13"/>
-      <w:headerReference w:type="default" r:id="rId14"/>
-      <w:footerReference w:type="even" r:id="rId15"/>
-      <w:footerReference w:type="default" r:id="rId16"/>
-      <w:headerReference w:type="first" r:id="rId17"/>
-      <w:footerReference w:type="first" r:id="rId18"/>
+      <w:headerReference w:type="even" r:id="rId14"/>
+      <w:headerReference w:type="default" r:id="rId15"/>
+      <w:footerReference w:type="even" r:id="rId16"/>
+      <w:footerReference w:type="default" r:id="rId17"/>
+      <w:headerReference w:type="first" r:id="rId18"/>
+      <w:footerReference w:type="first" r:id="rId19"/>
       <w:type w:val="continuous"/>
       <w:pgSz w:w="12240" w:h="15840"/>
       <w:pgMar w:top="1628" w:right="1134" w:bottom="1418" w:left="1418" w:header="709" w:footer="548" w:gutter="0"/>
@@ -42436,6 +43961,10 @@
 </go:gDocsCustomXmlDataStorage>
 </file>
 
+<file path=customXml/item2.xml><?xml version="1.0" encoding="utf-8"?>
+<b:Sources xmlns:b="http://schemas.openxmlformats.org/officeDocument/2006/bibliography" xmlns="http://schemas.openxmlformats.org/officeDocument/2006/bibliography" SelectedStyle="\APASixthEditionOfficeOnline.xsl" StyleName="APA" Version="6"/>
+</file>
+
 <file path=customXml/itemProps1.xml><?xml version="1.0" encoding="utf-8"?>
 <ds:datastoreItem xmlns:ds="http://schemas.openxmlformats.org/officeDocument/2006/customXml" ds:itemID="{11111111-1234-1234-1234-123412341234}">
   <ds:schemaRefs>
@@ -42443,4 +43972,12 @@
     <ds:schemaRef ds:uri="http://schemas.openxmlformats.org/officeDocument/2006/relationships"/>
   </ds:schemaRefs>
 </ds:datastoreItem>
+</file>
+
+<file path=customXml/itemProps2.xml><?xml version="1.0" encoding="utf-8"?>
+<ds:datastoreItem xmlns:ds="http://schemas.openxmlformats.org/officeDocument/2006/customXml" ds:itemID="{A926FFEC-628D-4FFA-94E3-A2C66F953C8E}">
+  <ds:schemaRefs>
+    <ds:schemaRef ds:uri="http://schemas.openxmlformats.org/officeDocument/2006/bibliography"/>
+  </ds:schemaRefs>
+</ds:datastoreItem>
 </file>
</xml_diff>